<commit_message>
Add migratory-strategy stratification and improved predictive validation
- Climate × effort interaction by life history: strongest in residents
  (HR=1.43), present in all migrant groups (~1.25); relaxes shared-slope assumption
- Rich-feature XGBoost prediction validated across three regimes:
  interpolation (random CV) 0.73, temporal leave-future-out 0.63,
  spatial-block extrapolation 0.56 — record process is region-specific
- New: code/67, Figure 9, 3 result tables; manuscript + Chinese summary updated

Co-Authored-By: Claude Opus 4.8 <noreply@anthropic.com>
</commit_message>
<xml_diff>
--- a/manuscript/manuscript_v4_integrated_NEE_EcolLett.docx
+++ b/manuscript/manuscript_v4_integrated_NEE_EcolLett.docx
@@ -2,7 +2,7 @@
 <file path=word/document.xml><?xml version="1.0" encoding="utf-8"?>
 <w:document xmlns:w="http://schemas.openxmlformats.org/wordprocessingml/2006/main" xmlns:m="http://schemas.openxmlformats.org/officeDocument/2006/math" xmlns:r="http://schemas.openxmlformats.org/officeDocument/2006/relationships" xmlns:o="urn:schemas-microsoft-com:office:office" xmlns:v="urn:schemas-microsoft-com:vml" xmlns:w10="urn:schemas-microsoft-com:office:word" xmlns:a="http://schemas.openxmlformats.org/drawingml/2006/main" xmlns:pic="http://schemas.openxmlformats.org/drawingml/2006/picture" xmlns:wp="http://schemas.openxmlformats.org/drawingml/2006/wordprocessingDrawing">
   <w:body>
-    <w:bookmarkStart w:id="59" w:name="X8aec6a2f48e178d741cce85e400cc41a0805672"/>
+    <w:bookmarkStart w:id="60" w:name="X8aec6a2f48e178d741cce85e400cc41a0805672"/>
     <w:p>
       <w:pPr>
         <w:pStyle w:val="Heading1"/>
@@ -407,43 +407,49 @@
         <w:t xml:space="preserve"> </w:t>
       </w:r>
       <w:r>
-        <w:t xml:space="preserve">effort-density discovery, defining an interpretable robustness boundary. Residual</w:t>
-      </w:r>
-      <w:r>
-        <w:t xml:space="preserve"> </w:t>
-      </w:r>
-      <w:r>
-        <w:t xml:space="preserve">spatial autocorrelation was negligible, though spatially honest</w:t>
-      </w:r>
-      <w:r>
-        <w:t xml:space="preserve"> </w:t>
-      </w:r>
-      <w:r>
-        <w:t xml:space="preserve">cross-validation showed the model transfers weakly across regions (block AUC ≈</w:t>
-      </w:r>
-      <w:r>
-        <w:t xml:space="preserve"> </w:t>
-      </w:r>
-      <w:r>
-        <w:t xml:space="preserve">0.55 vs random 0.65), so we frame it for inference rather than out-of-region</w:t>
-      </w:r>
-      <w:r>
-        <w:t xml:space="preserve"> </w:t>
-      </w:r>
-      <w:r>
-        <w:t xml:space="preserve">forecasting. We argue that new distribution records are best analysed as</w:t>
-      </w:r>
-      <w:r>
-        <w:t xml:space="preserve"> </w:t>
-      </w:r>
-      <w:r>
-        <w:t xml:space="preserve">effort-moderated visibility events, and that monitoring should target the</w:t>
-      </w:r>
-      <w:r>
-        <w:t xml:space="preserve"> </w:t>
-      </w:r>
-      <w:r>
-        <w:t xml:space="preserve">intersection of climatic exposure and effort gaps rather than projected hazard</w:t>
+        <w:t xml:space="preserve">effort-density discovery, defining an interpretable robustness boundary. The interaction was general across life histories but strongest in resident</w:t>
+      </w:r>
+      <w:r>
+        <w:t xml:space="preserve"> </w:t>
+      </w:r>
+      <w:r>
+        <w:t xml:space="preserve">species (HR = 1.43) and weaker in migrants (≈ 1.25). Predictive validation was</w:t>
+      </w:r>
+      <w:r>
+        <w:t xml:space="preserve"> </w:t>
+      </w:r>
+      <w:r>
+        <w:t xml:space="preserve">diagnostic of scope: a feature-rich model interpolated well (AUC 0.73) and</w:t>
+      </w:r>
+      <w:r>
+        <w:t xml:space="preserve"> </w:t>
+      </w:r>
+      <w:r>
+        <w:t xml:space="preserve">forecast forward usably (temporal leave-future-out AUC 0.63) but transferred</w:t>
+      </w:r>
+      <w:r>
+        <w:t xml:space="preserve"> </w:t>
+      </w:r>
+      <w:r>
+        <w:t xml:space="preserve">poorly across biogeographic regions (spatial-block AUC 0.56), identifying the</w:t>
+      </w:r>
+      <w:r>
+        <w:t xml:space="preserve"> </w:t>
+      </w:r>
+      <w:r>
+        <w:t xml:space="preserve">record process as region-specific. We argue that new distribution records are best</w:t>
+      </w:r>
+      <w:r>
+        <w:t xml:space="preserve"> </w:t>
+      </w:r>
+      <w:r>
+        <w:t xml:space="preserve">analysed as effort-moderated visibility events, and that monitoring should target</w:t>
+      </w:r>
+      <w:r>
+        <w:t xml:space="preserve"> </w:t>
+      </w:r>
+      <w:r>
+        <w:t xml:space="preserve">the intersection of climatic exposure and effort gaps rather than projected hazard</w:t>
       </w:r>
       <w:r>
         <w:t xml:space="preserve"> </w:t>
@@ -852,7 +858,7 @@
       </w:r>
     </w:p>
     <w:bookmarkEnd w:id="11"/>
-    <w:bookmarkStart w:id="21" w:name="results"/>
+    <w:bookmarkStart w:id="22" w:name="results"/>
     <w:p>
       <w:pPr>
         <w:pStyle w:val="Heading2"/>
@@ -4649,13 +4655,13 @@
       </w:r>
     </w:p>
     <w:bookmarkEnd w:id="18"/>
-    <w:bookmarkStart w:id="19" w:name="X1fb8dc1a27a9ba190faaac71e4428d0d5678944"/>
+    <w:bookmarkStart w:id="19" w:name="Xd1293f63dd7dee073aceb05be7004c8b6bf3193"/>
     <w:p>
       <w:pPr>
         <w:pStyle w:val="Heading3"/>
       </w:pPr>
       <w:r>
-        <w:t xml:space="preserve">Methodological robustness and diagnostics</w:t>
+        <w:t xml:space="preserve">Trait-mediated heterogeneity: residents versus migrants</w:t>
       </w:r>
     </w:p>
     <w:p>
@@ -4663,718 +4669,139 @@
         <w:pStyle w:val="FirstParagraph"/>
       </w:pPr>
       <w:r>
-        <w:t xml:space="preserve">Three independent estimates of the headline interaction — the originally</w:t>
-      </w:r>
-      <w:r>
-        <w:t xml:space="preserve"> </w:t>
-      </w:r>
-      <w:r>
-        <w:t xml:space="preserve">published fit, an exact refit on the same data, and the relaxed-set refit —</w:t>
-      </w:r>
-      <w:r>
-        <w:t xml:space="preserve"> </w:t>
-      </w:r>
-      <w:r>
-        <w:t xml:space="preserve">agreed closely: HR = 1.292, 1.288 and 1.274 respectively, a spread of under 0.02</w:t>
-      </w:r>
-      <w:r>
-        <w:t xml:space="preserve"> </w:t>
-      </w:r>
-      <w:r>
-        <w:t xml:space="preserve">HR units despite a fifteen-fold difference in sample size. Residual spatial</w:t>
-      </w:r>
-      <w:r>
-        <w:t xml:space="preserve"> </w:t>
-      </w:r>
-      <w:r>
-        <w:t xml:space="preserve">autocorrelation in the province interaction model was negligible at every tested</w:t>
-      </w:r>
-      <w:r>
-        <w:t xml:space="preserve"> </w:t>
-      </w:r>
-      <w:r>
-        <w:t xml:space="preserve">distance class (Moran's I = 1.4 × 10⁻⁵ at 100 km, p = 0.98; 2.1 × 10⁻⁴ at</w:t>
-      </w:r>
-      <w:r>
-        <w:t xml:space="preserve"> </w:t>
-      </w:r>
-      <w:r>
-        <w:t xml:space="preserve">250 km, p = 0.89; −6.6 × 10⁻⁵ at 500 km, p = 0.98), so the inference is not an</w:t>
-      </w:r>
-      <w:r>
-        <w:t xml:space="preserve"> </w:t>
-      </w:r>
-      <w:r>
-        <w:t xml:space="preserve">artefact of unmodelled spatial structure.</w:t>
+        <w:t xml:space="preserve">To relax the shared-slope assumption we refitted the interaction model separately</w:t>
+      </w:r>
+      <w:r>
+        <w:t xml:space="preserve"> </w:t>
+      </w:r>
+      <w:r>
+        <w:t xml:space="preserve">by migratory strategy (Fig. 9a). The climate × effort interaction was positive and</w:t>
+      </w:r>
+      <w:r>
+        <w:t xml:space="preserve"> </w:t>
+      </w:r>
+      <w:r>
+        <w:t xml:space="preserve">significant in every group, but strongest in</w:t>
+      </w:r>
+      <w:r>
+        <w:t xml:space="preserve"> </w:t>
+      </w:r>
+      <w:r>
+        <w:rPr>
+          <w:b/>
+          <w:bCs/>
+        </w:rPr>
+        <w:t xml:space="preserve">resident species</w:t>
+      </w:r>
+      <w:r>
+        <w:t xml:space="preserve"> </w:t>
+      </w:r>
+      <w:r>
+        <w:t xml:space="preserve">(HR = 1.43, 95%</w:t>
+      </w:r>
+      <w:r>
+        <w:t xml:space="preserve"> </w:t>
+      </w:r>
+      <w:r>
+        <w:t xml:space="preserve">CI 1.21–1.69, p = 2.9 × 10⁻⁵, 203 events) and somewhat weaker — though still</w:t>
+      </w:r>
+      <w:r>
+        <w:t xml:space="preserve"> </w:t>
+      </w:r>
+      <w:r>
+        <w:t xml:space="preserve">clearly significant — in migrants (combined HR = 1.25, p = 8.4 × 10⁻⁵; partial</w:t>
+      </w:r>
+      <w:r>
+        <w:t xml:space="preserve"> </w:t>
+      </w:r>
+      <w:r>
+        <w:t xml:space="preserve">migrants 1.27, p = 9.1 × 10⁻³; long-distance migrants 1.26, p = 1.8 × 10⁻³). The</w:t>
+      </w:r>
+      <w:r>
+        <w:t xml:space="preserve"> </w:t>
+      </w:r>
+      <w:r>
+        <w:t xml:space="preserve">pattern is ecologically coherent: a resident's range expansion becomes a record</w:t>
+      </w:r>
+      <w:r>
+        <w:t xml:space="preserve"> </w:t>
+      </w:r>
+      <w:r>
+        <w:t xml:space="preserve">only where observation effort is sufficient, so effort moderation is strongest for</w:t>
+      </w:r>
+      <w:r>
+        <w:t xml:space="preserve"> </w:t>
+      </w:r>
+      <w:r>
+        <w:t xml:space="preserve">residents; migrant and vagrant occurrences carry an additional</w:t>
+      </w:r>
+      <w:r>
+        <w:t xml:space="preserve"> </w:t>
+      </w:r>
+      <w:r>
+        <w:t xml:space="preserve">movement/stochastic component that dilutes, but does not remove, the</w:t>
+      </w:r>
+      <w:r>
+        <w:t xml:space="preserve"> </w:t>
+      </w:r>
+      <w:r>
+        <w:t xml:space="preserve">effort-moderated climate signal. The moderation mechanism is therefore general</w:t>
+      </w:r>
+      <w:r>
+        <w:t xml:space="preserve"> </w:t>
+      </w:r>
+      <w:r>
+        <w:t xml:space="preserve">across life histories rather than an artefact of one species group, while its</w:t>
+      </w:r>
+      <w:r>
+        <w:t xml:space="preserve"> </w:t>
+      </w:r>
+      <w:r>
+        <w:t xml:space="preserve">magnitude is trait-dependent.</w:t>
       </w:r>
     </w:p>
     <w:p>
       <w:pPr>
         <w:pStyle w:val="BodyText"/>
       </w:pPr>
-      <w:r>
-        <w:t xml:space="preserve">Predictive transfer is a different matter, and we report it candidly. A</w:t>
-      </w:r>
-      <w:r>
-        <w:t xml:space="preserve"> </w:t>
-      </w:r>
-      <w:r>
-        <w:t xml:space="preserve">gradient-boosted (XGBoost) classifier on the relaxed risk set reached a random</w:t>
-      </w:r>
-      <w:r>
-        <w:t xml:space="preserve"> </w:t>
-      </w:r>
-      <w:r>
-        <w:t xml:space="preserve">five-fold AUC of 0.777, but random folds leak spatially autocorrelated structure.</w:t>
-      </w:r>
-      <w:r>
-        <w:t xml:space="preserve"> </w:t>
-      </w:r>
-      <w:r>
-        <w:t xml:space="preserve">Under spatially honest cross-validation — holding out 250 km blocks of provinces</w:t>
-      </w:r>
-      <w:r>
-        <w:t xml:space="preserve"> </w:t>
-      </w:r>
-      <w:r>
-        <w:t xml:space="preserve">(blockCV, five folds) and predicting the interaction hazard model into unseen</w:t>
-      </w:r>
-      <w:r>
-        <w:t xml:space="preserve"> </w:t>
-      </w:r>
-      <w:r>
-        <w:t xml:space="preserve">regions — mean AUC fell to 0.55 (± 0.05), versus 0.65 (± 0.01) for matched random</w:t>
-      </w:r>
-      <w:r>
-        <w:t xml:space="preserve"> </w:t>
-      </w:r>
-      <w:r>
-        <w:t xml:space="preserve">folds on the same model. The model therefore identifies a real</w:t>
-      </w:r>
-      <w:r>
-        <w:t xml:space="preserve"> </w:t>
-      </w:r>
       <w:r>
         <w:rPr>
           <w:i/>
           <w:iCs/>
         </w:rPr>
-        <w:t xml:space="preserve">in-sample</w:t>
-      </w:r>
-      <w:r>
-        <w:t xml:space="preserve"> </w:t>
-      </w:r>
-      <w:r>
-        <w:t xml:space="preserve">record-generating structure but transfers weakly across regions: random CV</w:t>
-      </w:r>
-      <w:r>
-        <w:t xml:space="preserve"> </w:t>
-      </w:r>
-      <w:r>
-        <w:t xml:space="preserve">overstates skill by roughly 0.1 AUC, and out-of-region forecasting from this model</w:t>
-      </w:r>
-      <w:r>
-        <w:t xml:space="preserve"> </w:t>
-      </w:r>
-      <w:r>
-        <w:t xml:space="preserve">should be treated cautiously. This reinforces our recommendation to use the</w:t>
-      </w:r>
-      <w:r>
-        <w:t xml:space="preserve"> </w:t>
-      </w:r>
-      <w:r>
-        <w:t xml:space="preserve">framework for inference and prioritisation logic rather than for ranking unseen</w:t>
-      </w:r>
-      <w:r>
-        <w:t xml:space="preserve"> </w:t>
-      </w:r>
-      <w:r>
-        <w:t xml:space="preserve">regions on absolute predicted hazard.</w:t>
-      </w:r>
-    </w:p>
-    <w:bookmarkEnd w:id="19"/>
-    <w:bookmarkStart w:id="20" w:name="Xf6b8a49f993c053d077250f35ee4dee86cbd481"/>
-    <w:p>
-      <w:pPr>
-        <w:pStyle w:val="Heading3"/>
-      </w:pPr>
-      <w:r>
-        <w:t xml:space="preserve">Scenario-based future hazard and the priority surface it implies</w:t>
-      </w:r>
-    </w:p>
-    <w:p>
-      <w:pPr>
-        <w:pStyle w:val="FirstParagraph"/>
-      </w:pPr>
-      <w:r>
-        <w:t xml:space="preserve">Projecting the fitted province relationship forward under CMIP6 climate</w:t>
-      </w:r>
-      <w:r>
-        <w:t xml:space="preserve"> </w:t>
-      </w:r>
-      <w:r>
-        <w:t xml:space="preserve">trajectories (effort held at its 2024 level), mean province hazard rose under</w:t>
-      </w:r>
-      <w:r>
-        <w:t xml:space="preserve"> </w:t>
-      </w:r>
-      <w:r>
-        <w:t xml:space="preserve">both shared socioeconomic pathways and most steeply under SSP585, from 0.087 in</w:t>
-      </w:r>
-      <w:r>
-        <w:t xml:space="preserve"> </w:t>
-      </w:r>
-      <w:r>
-        <w:t xml:space="preserve">2030 to 0.308 in 2050 and 0.760 in 2080 (versus 0.067, 0.111 and 0.230 under</w:t>
-      </w:r>
-      <w:r>
-        <w:t xml:space="preserve"> </w:t>
-      </w:r>
-      <w:r>
-        <w:t xml:space="preserve">SSP245). The highest SSP585-2050 hazards fell in eastern, high-effort provinces —</w:t>
-      </w:r>
-      <w:r>
-        <w:t xml:space="preserve"> </w:t>
-      </w:r>
-      <w:r>
-        <w:t xml:space="preserve">Jiangsu (0.76), Zhejiang (0.73), Hubei (0.61), Fujian (0.49) and Henan (0.48).</w:t>
-      </w:r>
-    </w:p>
-    <w:p>
-      <w:pPr>
-        <w:pStyle w:val="BodyText"/>
-      </w:pPr>
-      <w:r>
-        <w:t xml:space="preserve">This eastern concentration is, by construction, partly a restatement of the</w:t>
-      </w:r>
-      <w:r>
-        <w:t xml:space="preserve"> </w:t>
-      </w:r>
-      <w:r>
-        <w:t xml:space="preserve">current effort map: because the model is multiplicative and effort is frozen at</w:t>
-      </w:r>
-      <w:r>
-        <w:t xml:space="preserve"> </w:t>
-      </w:r>
-      <w:r>
-        <w:t xml:space="preserve">its 2024 (high-in-the-east) values, the provinces that already record the most</w:t>
-      </w:r>
-      <w:r>
-        <w:t xml:space="preserve"> </w:t>
-      </w:r>
-      <w:r>
-        <w:t xml:space="preserve">will also be projected to</w:t>
-      </w:r>
-      <w:r>
-        <w:t xml:space="preserve"> </w:t>
+        <w:t xml:space="preserve">Source:</w:t>
       </w:r>
       <w:r>
         <w:rPr>
           <w:i/>
           <w:iCs/>
         </w:rPr>
-        <w:t xml:space="preserve">see</w:t>
-      </w:r>
-      <w:r>
-        <w:t xml:space="preserve"> </w:t>
-      </w:r>
-      <w:r>
-        <w:t xml:space="preserve">the most. The absolute hazard surface therefore</w:t>
-      </w:r>
-      <w:r>
-        <w:t xml:space="preserve"> </w:t>
-      </w:r>
-      <w:r>
-        <w:t xml:space="preserve">answers "where will new records appear under continued observation," not "where</w:t>
-      </w:r>
-      <w:r>
-        <w:t xml:space="preserve"> </w:t>
-      </w:r>
-      <w:r>
-        <w:t xml:space="preserve">will range change occur." The decision-relevant quantity is different and is the</w:t>
-      </w:r>
-      <w:r>
-        <w:t xml:space="preserve"> </w:t>
-      </w:r>
-      <w:r>
-        <w:t xml:space="preserve">one we recommend acting on: the product of projected climatic exposure and the</w:t>
-      </w:r>
-      <w:r>
-        <w:t xml:space="preserve"> </w:t>
-      </w:r>
-      <w:r>
-        <w:rPr>
+        <w:t xml:space="preserve"> </w:t>
+      </w:r>
+      <w:r>
+        <w:rPr>
+          <w:rStyle w:val="VerbatimChar"/>
           <w:i/>
           <w:iCs/>
         </w:rPr>
-        <w:t xml:space="preserve">current effort gap</w:t>
-      </w:r>
-      <w:r>
-        <w:t xml:space="preserve">. Units that combine high future exposure with low present</w:t>
-      </w:r>
-      <w:r>
-        <w:t xml:space="preserve"> </w:t>
-      </w:r>
-      <w:r>
-        <w:t xml:space="preserve">effort are where modest survey investment most converts latent redistribution</w:t>
-      </w:r>
-      <w:r>
-        <w:t xml:space="preserve"> </w:t>
-      </w:r>
-      <w:r>
-        <w:t xml:space="preserve">into evidence; they are systematically not the eastern provinces that dominate the</w:t>
-      </w:r>
-      <w:r>
-        <w:t xml:space="preserve"> </w:t>
-      </w:r>
-      <w:r>
-        <w:t xml:space="preserve">raw hazard surface. We therefore present the absolute maps as scenario context and</w:t>
-      </w:r>
-      <w:r>
-        <w:t xml:space="preserve"> </w:t>
-      </w:r>
-      <w:r>
-        <w:t xml:space="preserve">the exposure-times-effort-gap surface as the operational recommendation, and we</w:t>
-      </w:r>
-      <w:r>
-        <w:t xml:space="preserve"> </w:t>
-      </w:r>
-      <w:r>
-        <w:t xml:space="preserve">treat explicit effort-growth scenarios as a method-ready extension rather than</w:t>
-      </w:r>
-      <w:r>
-        <w:t xml:space="preserve"> </w:t>
-      </w:r>
-      <w:r>
-        <w:t xml:space="preserve">reporting frozen-effort absolute maps as forecasts of biological change.</w:t>
-      </w:r>
-    </w:p>
-    <w:bookmarkEnd w:id="20"/>
-    <w:bookmarkEnd w:id="21"/>
-    <w:bookmarkStart w:id="29" w:name="discussion"/>
-    <w:p>
-      <w:pPr>
-        <w:pStyle w:val="Heading2"/>
-      </w:pPr>
-      <w:r>
-        <w:t xml:space="preserve">Discussion</w:t>
-      </w:r>
-    </w:p>
-    <w:bookmarkStart w:id="22" w:name="X4278a7fd1464437e46d61cb567f6129aff378bb"/>
-    <w:p>
-      <w:pPr>
-        <w:pStyle w:val="Heading3"/>
-      </w:pPr>
-      <w:r>
-        <w:t xml:space="preserve">Effort as a visibility moderator reframes the new record</w:t>
-      </w:r>
-    </w:p>
-    <w:p>
-      <w:pPr>
-        <w:pStyle w:val="FirstParagraph"/>
-      </w:pPr>
-      <w:r>
-        <w:t xml:space="preserve">The data support a specific and, we think, consequential reading of new</w:t>
-      </w:r>
-      <w:r>
-        <w:t xml:space="preserve"> </w:t>
-      </w:r>
-      <w:r>
-        <w:t xml:space="preserve">distribution records: they are effort-moderated visibility events. The</w:t>
-      </w:r>
-      <w:r>
-        <w:t xml:space="preserve"> </w:t>
-      </w:r>
-      <w:r>
-        <w:t xml:space="preserve">climate-by-effort interaction was positive and decisively supported over the</w:t>
-      </w:r>
-      <w:r>
-        <w:t xml:space="preserve"> </w:t>
-      </w:r>
-      <w:r>
-        <w:t xml:space="preserve">additive model under every effort metric; the direct interaction-versus-offset</w:t>
-      </w:r>
-      <w:r>
-        <w:t xml:space="preserve"> </w:t>
-      </w:r>
-      <w:r>
-        <w:t xml:space="preserve">test identified effort as a moderator of the climate-hazard slope rather than a</w:t>
-      </w:r>
-      <w:r>
-        <w:t xml:space="preserve"> </w:t>
-      </w:r>
-      <w:r>
-        <w:t xml:space="preserve">multiplicative scaling of records; and the interaction persisted, slightly</w:t>
-      </w:r>
-      <w:r>
-        <w:t xml:space="preserve"> </w:t>
-      </w:r>
-      <w:r>
-        <w:t xml:space="preserve">strengthened, when effort was measured a year before the event, which orders the</w:t>
-      </w:r>
-      <w:r>
-        <w:t xml:space="preserve"> </w:t>
-      </w:r>
-      <w:r>
-        <w:t xml:space="preserve">two temporally as moderation predicts and weakens the reverse-causation</w:t>
-      </w:r>
-      <w:r>
-        <w:t xml:space="preserve"> </w:t>
-      </w:r>
-      <w:r>
-        <w:t xml:space="preserve">alternative. High climatic exposure without sufficient</w:t>
-      </w:r>
-      <w:r>
-        <w:t xml:space="preserve"> </w:t>
-      </w:r>
-      <w:r>
-        <w:t xml:space="preserve">survey effort stays unseen; high effort in climatically exposed places turns</w:t>
-      </w:r>
-      <w:r>
-        <w:t xml:space="preserve"> </w:t>
-      </w:r>
-      <w:r>
-        <w:t xml:space="preserve">redistribution into a recorded event. Treating effort only as an additive</w:t>
-      </w:r>
-      <w:r>
-        <w:t xml:space="preserve"> </w:t>
-      </w:r>
-      <w:r>
-        <w:t xml:space="preserve">nuisance or an offset, the two most common corrections in the literature,</w:t>
-      </w:r>
-      <w:r>
-        <w:t xml:space="preserve"> </w:t>
-      </w:r>
-      <w:r>
-        <w:t xml:space="preserve">therefore mis-specifies the record-generating process in a direction that biases</w:t>
-      </w:r>
-      <w:r>
-        <w:t xml:space="preserve"> </w:t>
-      </w:r>
-      <w:r>
-        <w:t xml:space="preserve">range-shift inference toward well-surveyed landscapes.</w:t>
-      </w:r>
-    </w:p>
-    <w:p>
-      <w:pPr>
-        <w:pStyle w:val="BodyText"/>
-      </w:pPr>
-      <w:r>
-        <w:t xml:space="preserve">The interaction-versus-offset comparison deserves emphasis as a reusable tool.</w:t>
-      </w:r>
-      <w:r>
-        <w:t xml:space="preserve"> </w:t>
-      </w:r>
-      <w:r>
-        <w:t xml:space="preserve">Much of biodiversity informatics corrects for effort by including it as a</w:t>
-      </w:r>
-      <w:r>
-        <w:t xml:space="preserve"> </w:t>
-      </w:r>
-      <w:r>
-        <w:t xml:space="preserve">covariate or offset and then proceeds as if the climate signal has been</w:t>
-      </w:r>
-      <w:r>
-        <w:t xml:space="preserve"> </w:t>
-      </w:r>
-      <w:r>
-        <w:t xml:space="preserve">cleansed. Our result shows that this step is itself a testable hypothesis: where</w:t>
-      </w:r>
-      <w:r>
-        <w:t xml:space="preserve"> </w:t>
-      </w:r>
-      <w:r>
-        <w:t xml:space="preserve">the offset model loses decisively to the interaction model, effort is doing more</w:t>
-      </w:r>
-      <w:r>
-        <w:t xml:space="preserve"> </w:t>
-      </w:r>
-      <w:r>
-        <w:t xml:space="preserve">than scaling, and the "corrected" climate signal is conditional on observation</w:t>
-      </w:r>
-      <w:r>
-        <w:t xml:space="preserve"> </w:t>
-      </w:r>
-      <w:r>
-        <w:t xml:space="preserve">intensity. The comparison is cheap to run and we suggest it be reported routinely</w:t>
-      </w:r>
-      <w:r>
-        <w:t xml:space="preserve"> </w:t>
-      </w:r>
-      <w:r>
-        <w:t xml:space="preserve">whenever effort is modelled.</w:t>
-      </w:r>
-    </w:p>
-    <w:bookmarkEnd w:id="22"/>
-    <w:bookmarkStart w:id="23" w:name="X41bc338843b808c8be925140991f92cf50206b6"/>
-    <w:p>
-      <w:pPr>
-        <w:pStyle w:val="Heading3"/>
-      </w:pPr>
-      <w:r>
-        <w:t xml:space="preserve">The robustness boundary is part of the result</w:t>
-      </w:r>
-    </w:p>
-    <w:p>
-      <w:pPr>
-        <w:pStyle w:val="FirstParagraph"/>
-      </w:pPr>
-      <w:r>
-        <w:t xml:space="preserve">Expanding the risk set fifteen-fold preserved the province-scale interaction and</w:t>
-      </w:r>
-      <w:r>
-        <w:t xml:space="preserve"> </w:t>
-      </w:r>
-      <w:r>
-        <w:t xml:space="preserve">sharpened its significance, which rules out the conservative SDM filter as the</w:t>
-      </w:r>
-      <w:r>
-        <w:t xml:space="preserve"> </w:t>
-      </w:r>
-      <w:r>
-        <w:t xml:space="preserve">source of the effect. The same expansion dissolved the interaction at finer</w:t>
-      </w:r>
-      <w:r>
-        <w:t xml:space="preserve"> </w:t>
-      </w:r>
-      <w:r>
-        <w:t xml:space="preserve">scales and demoted it in machine-learning importance, because the added species</w:t>
-      </w:r>
-      <w:r>
-        <w:t xml:space="preserve"> </w:t>
-      </w:r>
-      <w:r>
-        <w:t xml:space="preserve">are dominated by effort-density discovery rather than climate-effort moderation.</w:t>
-      </w:r>
-      <w:r>
-        <w:t xml:space="preserve"> </w:t>
-      </w:r>
-      <w:r>
-        <w:t xml:space="preserve">Rather than averaging these regimes into a single weaker estimate, the framework</w:t>
-      </w:r>
-      <w:r>
-        <w:t xml:space="preserve"> </w:t>
-      </w:r>
-      <w:r>
-        <w:t xml:space="preserve">locates the boundary between them. For a well-modelled species core the</w:t>
-      </w:r>
-      <w:r>
-        <w:t xml:space="preserve"> </w:t>
-      </w:r>
-      <w:r>
-        <w:t xml:space="preserve">visibility mechanism is climate-effort interaction; for the long tail of</w:t>
-      </w:r>
-      <w:r>
-        <w:t xml:space="preserve"> </w:t>
-      </w:r>
-      <w:r>
-        <w:t xml:space="preserve">SDM-borderline and rare taxa it is raw effort. Conservation and macroecological</w:t>
-      </w:r>
-      <w:r>
-        <w:t xml:space="preserve"> </w:t>
-      </w:r>
-      <w:r>
-        <w:t xml:space="preserve">applications that pool all species risk diluting a real mechanism with a</w:t>
-      </w:r>
-      <w:r>
-        <w:t xml:space="preserve"> </w:t>
-      </w:r>
-      <w:r>
-        <w:t xml:space="preserve">different one, and should report results for the core and the tail separately.</w:t>
-      </w:r>
-    </w:p>
-    <w:bookmarkEnd w:id="23"/>
-    <w:bookmarkStart w:id="24" w:name="scale-attenuation-without-reversal"/>
-    <w:p>
-      <w:pPr>
-        <w:pStyle w:val="Heading3"/>
-      </w:pPr>
-      <w:r>
-        <w:t xml:space="preserve">Scale attenuation without reversal</w:t>
-      </w:r>
-    </w:p>
-    <w:p>
-      <w:pPr>
-        <w:pStyle w:val="FirstParagraph"/>
-      </w:pPr>
-      <w:r>
-        <w:t xml:space="preserve">The province-to-county attenuation in the conservative analysis is consistent</w:t>
-      </w:r>
-      <w:r>
-        <w:t xml:space="preserve"> </w:t>
-      </w:r>
-      <w:r>
-        <w:t xml:space="preserve">with a signal carried partly by broad gradients in climatic exposure and survey</w:t>
-      </w:r>
-      <w:r>
-        <w:t xml:space="preserve"> </w:t>
-      </w:r>
-      <w:r>
-        <w:t xml:space="preserve">infrastructure. Finer administrative units fragment events, raise local</w:t>
-      </w:r>
-      <w:r>
-        <w:t xml:space="preserve"> </w:t>
-      </w:r>
-      <w:r>
-        <w:t xml:space="preserve">heterogeneity and shrink the estimable interaction, but the sign is preserved</w:t>
-      </w:r>
-      <w:r>
-        <w:t xml:space="preserve"> </w:t>
-      </w:r>
-      <w:r>
-        <w:t xml:space="preserve">and the interaction model remains preferred at every scale. This is a textbook</w:t>
-      </w:r>
-      <w:r>
-        <w:t xml:space="preserve"> </w:t>
-      </w:r>
-      <w:r>
-        <w:t xml:space="preserve">modifiable-areal-unit pattern (Openshaw 1984) acting on effect size, and it cautions against</w:t>
-      </w:r>
-      <w:r>
-        <w:t xml:space="preserve"> </w:t>
-      </w:r>
-      <w:r>
-        <w:t xml:space="preserve">reading the loss of significance at county scale as evidence against the</w:t>
-      </w:r>
-      <w:r>
-        <w:t xml:space="preserve"> </w:t>
-      </w:r>
-      <w:r>
-        <w:t xml:space="preserve">mechanism. It also cautions against the opposite error — proxying coarse climate</w:t>
-      </w:r>
-      <w:r>
-        <w:t xml:space="preserve"> </w:t>
-      </w:r>
-      <w:r>
-        <w:t xml:space="preserve">or effort onto fine grids, which manufactures apparent fine-scale signal from</w:t>
-      </w:r>
-      <w:r>
-        <w:t xml:space="preserve"> </w:t>
-      </w:r>
-      <w:r>
-        <w:t xml:space="preserve">aggregate gradients. Genuine fine-scale inference requires fine-scale</w:t>
-      </w:r>
-      <w:r>
-        <w:t xml:space="preserve"> </w:t>
-      </w:r>
-      <w:r>
-        <w:t xml:space="preserve">covariates, which is why our prefecture and county refits draw effort from raw</w:t>
-      </w:r>
-      <w:r>
-        <w:t xml:space="preserve"> </w:t>
-      </w:r>
-      <w:r>
-        <w:t xml:space="preserve">geolocated records rather than from province broadcasts.</w:t>
-      </w:r>
-    </w:p>
-    <w:bookmarkEnd w:id="24"/>
-    <w:bookmarkStart w:id="25" w:name="X37055fb27accea50bb61665d21b7429344146cc"/>
-    <w:p>
-      <w:pPr>
-        <w:pStyle w:val="Heading3"/>
-      </w:pPr>
-      <w:r>
-        <w:t xml:space="preserve">Implications for monitoring under climate change</w:t>
-      </w:r>
-    </w:p>
-    <w:p>
-      <w:pPr>
-        <w:pStyle w:val="FirstParagraph"/>
-      </w:pPr>
-      <w:r>
-        <w:t xml:space="preserve">If new records are effort-moderated visibility events, then raw projected hazard</w:t>
-      </w:r>
-      <w:r>
-        <w:t xml:space="preserve"> </w:t>
-      </w:r>
-      <w:r>
-        <w:t xml:space="preserve">is a poor guide to where survey investment is most valuable. Our province</w:t>
-      </w:r>
-      <w:r>
-        <w:t xml:space="preserve"> </w:t>
-      </w:r>
-      <w:r>
-        <w:t xml:space="preserve">projections concentrate future hazard in eastern, high-effort provinces — places</w:t>
-      </w:r>
-      <w:r>
-        <w:t xml:space="preserve"> </w:t>
-      </w:r>
-      <w:r>
-        <w:t xml:space="preserve">where the model expects climatic exposure to become highly</w:t>
-      </w:r>
-      <w:r>
-        <w:t xml:space="preserve"> </w:t>
+        <w:t xml:space="preserve">results/tables/table_migratory_stratified_interaction.csv</w:t>
       </w:r>
       <w:r>
         <w:rPr>
           <w:i/>
           <w:iCs/>
         </w:rPr>
-        <w:t xml:space="preserve">visible</w:t>
-      </w:r>
-      <w:r>
-        <w:t xml:space="preserve"> </w:t>
-      </w:r>
-      <w:r>
-        <w:t xml:space="preserve">under</w:t>
-      </w:r>
-      <w:r>
-        <w:t xml:space="preserve"> </w:t>
-      </w:r>
-      <w:r>
-        <w:t xml:space="preserve">existing effort, not necessarily where range change is most novel. Allocating</w:t>
-      </w:r>
-      <w:r>
-        <w:t xml:space="preserve"> </w:t>
-      </w:r>
-      <w:r>
-        <w:t xml:space="preserve">effort to these provinces maximises the rate of new records but adds little to</w:t>
-      </w:r>
-      <w:r>
-        <w:t xml:space="preserve"> </w:t>
-      </w:r>
-      <w:r>
-        <w:t xml:space="preserve">what is already well observed. The more informative targets are units where high</w:t>
-      </w:r>
-      <w:r>
-        <w:t xml:space="preserve"> </w:t>
-      </w:r>
-      <w:r>
-        <w:t xml:space="preserve">projected climatic exposure coincides with a current effort gap: there, modest</w:t>
-      </w:r>
-      <w:r>
-        <w:t xml:space="preserve"> </w:t>
-      </w:r>
-      <w:r>
-        <w:t xml:space="preserve">additional effort converts latent redistribution into evidence and most reduces</w:t>
-      </w:r>
-      <w:r>
-        <w:t xml:space="preserve"> </w:t>
-      </w:r>
-      <w:r>
-        <w:t xml:space="preserve">uncertainty. We therefore recommend prioritising on the product of climatic</w:t>
-      </w:r>
-      <w:r>
-        <w:t xml:space="preserve"> </w:t>
-      </w:r>
-      <w:r>
-        <w:t xml:space="preserve">exposure and effort deficit, and reporting forecast uncertainty alongside the</w:t>
-      </w:r>
-      <w:r>
-        <w:t xml:space="preserve"> </w:t>
-      </w:r>
-      <w:r>
-        <w:t xml:space="preserve">point hazard, rather than ranking units on projected hazard alone.</w:t>
-      </w:r>
-    </w:p>
-    <w:bookmarkEnd w:id="25"/>
-    <w:bookmarkStart w:id="26" w:name="generality-beyond-birds-in-china"/>
+        <w:t xml:space="preserve">.</w:t>
+      </w:r>
+    </w:p>
+    <w:bookmarkEnd w:id="19"/>
+    <w:bookmarkStart w:id="20" w:name="X1fb8dc1a27a9ba190faaac71e4428d0d5678944"/>
     <w:p>
       <w:pPr>
         <w:pStyle w:val="Heading3"/>
       </w:pPr>
       <w:r>
-        <w:t xml:space="preserve">Generality beyond birds in China</w:t>
+        <w:t xml:space="preserve">Methodological robustness and diagnostics</w:t>
       </w:r>
     </w:p>
     <w:p>
@@ -5382,301 +4809,149 @@
         <w:pStyle w:val="FirstParagraph"/>
       </w:pPr>
       <w:r>
-        <w:t xml:space="preserve">We demonstrate the framework on one taxon in one country, but neither the</w:t>
-      </w:r>
-      <w:r>
-        <w:t xml:space="preserve"> </w:t>
-      </w:r>
-      <w:r>
-        <w:t xml:space="preserve">mechanism nor the method is China- or bird-specific. The visibility argument —</w:t>
-      </w:r>
-      <w:r>
-        <w:t xml:space="preserve"> </w:t>
-      </w:r>
-      <w:r>
-        <w:t xml:space="preserve">that a record requires ecological exposure and observation to coincide</w:t>
-      </w:r>
-      <w:r>
-        <w:t xml:space="preserve"> </w:t>
-      </w:r>
-      <w:r>
-        <w:t xml:space="preserve">multiplicatively — applies wherever occurrence data are assembled under uneven and</w:t>
-      </w:r>
-      <w:r>
-        <w:t xml:space="preserve"> </w:t>
-      </w:r>
-      <w:r>
-        <w:t xml:space="preserve">growing effort, which is to say essentially all biodiversity informatics. The two</w:t>
-      </w:r>
-      <w:r>
-        <w:t xml:space="preserve"> </w:t>
-      </w:r>
-      <w:r>
-        <w:t xml:space="preserve">transferable contributions are method-level and travel directly: the</w:t>
-      </w:r>
-      <w:r>
-        <w:t xml:space="preserve"> </w:t>
-      </w:r>
-      <w:r>
-        <w:t xml:space="preserve">discrete-time hazard formulation of "new records," and the interaction-versus-offset</w:t>
-      </w:r>
-      <w:r>
-        <w:t xml:space="preserve"> </w:t>
-      </w:r>
-      <w:r>
-        <w:t xml:space="preserve">test that distinguishes effort-as-moderator from effort-as-scaling. China and</w:t>
-      </w:r>
-      <w:r>
-        <w:t xml:space="preserve"> </w:t>
-      </w:r>
-      <w:r>
-        <w:t xml:space="preserve">birds are a demanding rather than a convenient case, combining steep climatic</w:t>
-      </w:r>
-      <w:r>
-        <w:t xml:space="preserve"> </w:t>
-      </w:r>
-      <w:r>
-        <w:t xml:space="preserve">gradients with order-of-magnitude effort growth, so a positive result here is</w:t>
-      </w:r>
-      <w:r>
-        <w:t xml:space="preserve"> </w:t>
-      </w:r>
-      <w:r>
-        <w:t xml:space="preserve">informative about the general phenomenon. We nonetheless treat broad generality as</w:t>
-      </w:r>
-      <w:r>
-        <w:t xml:space="preserve"> </w:t>
-      </w:r>
-      <w:r>
-        <w:t xml:space="preserve">a hypothesis to be tested: the natural next steps are replication in a second</w:t>
-      </w:r>
-      <w:r>
-        <w:t xml:space="preserve"> </w:t>
-      </w:r>
-      <w:r>
-        <w:t xml:space="preserve">taxon with contrasting detectability (for example plants or insects) and in a</w:t>
-      </w:r>
-      <w:r>
-        <w:t xml:space="preserve"> </w:t>
-      </w:r>
-      <w:r>
-        <w:t xml:space="preserve">region with a different effort trajectory, which we flag as a pre-registered</w:t>
-      </w:r>
-      <w:r>
-        <w:t xml:space="preserve"> </w:t>
-      </w:r>
-      <w:r>
-        <w:t xml:space="preserve">extension rather than a claim made here.</w:t>
-      </w:r>
-    </w:p>
-    <w:bookmarkEnd w:id="26"/>
-    <w:bookmarkStart w:id="27" w:name="limitations"/>
-    <w:p>
-      <w:pPr>
-        <w:pStyle w:val="Heading3"/>
-      </w:pPr>
-      <w:r>
-        <w:t xml:space="preserve">Limitations</w:t>
-      </w:r>
-    </w:p>
-    <w:p>
-      <w:pPr>
-        <w:pStyle w:val="FirstParagraph"/>
-      </w:pPr>
-      <w:r>
-        <w:t xml:space="preserve">Six limitations bound these conclusions, and we state the most serious first.</w:t>
+        <w:t xml:space="preserve">Three independent estimates of the headline interaction — the originally</w:t>
+      </w:r>
+      <w:r>
+        <w:t xml:space="preserve"> </w:t>
+      </w:r>
+      <w:r>
+        <w:t xml:space="preserve">published fit, an exact refit on the same data, and the relaxed-set refit —</w:t>
+      </w:r>
+      <w:r>
+        <w:t xml:space="preserve"> </w:t>
+      </w:r>
+      <w:r>
+        <w:t xml:space="preserve">agreed closely: HR = 1.292, 1.288 and 1.274 respectively, a spread of under 0.02</w:t>
+      </w:r>
+      <w:r>
+        <w:t xml:space="preserve"> </w:t>
+      </w:r>
+      <w:r>
+        <w:t xml:space="preserve">HR units despite a fifteen-fold difference in sample size. Residual spatial</w:t>
+      </w:r>
+      <w:r>
+        <w:t xml:space="preserve"> </w:t>
+      </w:r>
+      <w:r>
+        <w:t xml:space="preserve">autocorrelation in the province interaction model was negligible at every tested</w:t>
+      </w:r>
+      <w:r>
+        <w:t xml:space="preserve"> </w:t>
+      </w:r>
+      <w:r>
+        <w:t xml:space="preserve">distance class (Moran's I = 1.4 × 10⁻⁵ at 100 km, p = 0.98; 2.1 × 10⁻⁴ at</w:t>
+      </w:r>
+      <w:r>
+        <w:t xml:space="preserve"> </w:t>
+      </w:r>
+      <w:r>
+        <w:t xml:space="preserve">250 km, p = 0.89; −6.6 × 10⁻⁵ at 500 km, p = 0.98), so the inference is not an</w:t>
+      </w:r>
+      <w:r>
+        <w:t xml:space="preserve"> </w:t>
+      </w:r>
+      <w:r>
+        <w:t xml:space="preserve">artefact of unmodelled spatial structure.</w:t>
       </w:r>
     </w:p>
     <w:p>
       <w:pPr>
         <w:pStyle w:val="BodyText"/>
       </w:pPr>
+      <w:r>
+        <w:t xml:space="preserve">Predictive transfer depends on</w:t>
+      </w:r>
+      <w:r>
+        <w:t xml:space="preserve"> </w:t>
+      </w:r>
+      <w:r>
+        <w:rPr>
+          <w:i/>
+          <w:iCs/>
+        </w:rPr>
+        <w:t xml:space="preserve">what</w:t>
+      </w:r>
+      <w:r>
+        <w:t xml:space="preserve"> </w:t>
+      </w:r>
+      <w:r>
+        <w:t xml:space="preserve">is being predicted, and we evaluate it</w:t>
+      </w:r>
+      <w:r>
+        <w:t xml:space="preserve"> </w:t>
+      </w:r>
+      <w:r>
+        <w:t xml:space="preserve">candidly along three axes with a richer gradient-boosted model (XGBoost on 20</w:t>
+      </w:r>
+      <w:r>
+        <w:t xml:space="preserve"> </w:t>
+      </w:r>
+      <w:r>
+        <w:t xml:space="preserve">climate, effort, interaction and trait features; Fig. 9b). For</w:t>
+      </w:r>
+      <w:r>
+        <w:t xml:space="preserve"> </w:t>
+      </w:r>
       <w:r>
         <w:rPr>
           <w:b/>
           <w:bCs/>
         </w:rPr>
-        <w:t xml:space="preserve">Endogeneity of effort.</w:t>
-      </w:r>
-      <w:r>
-        <w:t xml:space="preserve"> </w:t>
-      </w:r>
-      <w:r>
-        <w:t xml:space="preserve">Effort is not strictly exogenous: observers</w:t>
-      </w:r>
-      <w:r>
-        <w:t xml:space="preserve"> </w:t>
-      </w:r>
-      <w:r>
-        <w:t xml:space="preserve">preferentially visit places with recent notable records, and a new record can</w:t>
-      </w:r>
-      <w:r>
-        <w:t xml:space="preserve"> </w:t>
-      </w:r>
-      <w:r>
-        <w:t xml:space="preserve">attract subsequent effort. We addressed the simplest form of this — concurrent</w:t>
-      </w:r>
-      <w:r>
-        <w:t xml:space="preserve"> </w:t>
-      </w:r>
-      <w:r>
-        <w:t xml:space="preserve">reverse causation — with the one-year effort lag, which preserved the interaction</w:t>
-      </w:r>
-      <w:r>
-        <w:t xml:space="preserve"> </w:t>
-      </w:r>
-      <w:r>
-        <w:t xml:space="preserve">(Table 3); effort measured before the event year cannot respond to that event.</w:t>
-      </w:r>
-      <w:r>
-        <w:t xml:space="preserve"> </w:t>
-      </w:r>
-      <w:r>
-        <w:t xml:space="preserve">What the lag does not remove is confounding from slow-moving, unmeasured</w:t>
-      </w:r>
-      <w:r>
-        <w:t xml:space="preserve"> </w:t>
-      </w:r>
-      <w:r>
-        <w:t xml:space="preserve">province-level traits that make a region simultaneously well-watched and</w:t>
-      </w:r>
-      <w:r>
-        <w:t xml:space="preserve"> </w:t>
-      </w:r>
-      <w:r>
-        <w:t xml:space="preserve">climatically dynamic. Stronger identification would come from an external</w:t>
-      </w:r>
-      <w:r>
-        <w:t xml:space="preserve"> </w:t>
-      </w:r>
-      <w:r>
-        <w:t xml:space="preserve">instrument for effort (e.g. human-population or road density) or a</w:t>
-      </w:r>
-      <w:r>
-        <w:t xml:space="preserve"> </w:t>
-      </w:r>
-      <w:r>
-        <w:t xml:space="preserve">quasi-experiment in effort allocation; we regard the lag as a strong but not</w:t>
-      </w:r>
-      <w:r>
-        <w:t xml:space="preserve"> </w:t>
-      </w:r>
-      <w:r>
-        <w:t xml:space="preserve">complete defense and retain "moderator" as a statement about the record-generating</w:t>
-      </w:r>
-      <w:r>
-        <w:t xml:space="preserve"> </w:t>
-      </w:r>
-      <w:r>
-        <w:t xml:space="preserve">model that is now also temporally ordered, while flagging full causal</w:t>
-      </w:r>
-      <w:r>
-        <w:t xml:space="preserve"> </w:t>
-      </w:r>
-      <w:r>
-        <w:t xml:space="preserve">identification as open.</w:t>
-      </w:r>
-    </w:p>
-    <w:p>
-      <w:pPr>
-        <w:pStyle w:val="BodyText"/>
-      </w:pPr>
+        <w:t xml:space="preserve">within-domain</w:t>
+      </w:r>
       <w:r>
         <w:rPr>
           <w:b/>
           <w:bCs/>
         </w:rPr>
-        <w:t xml:space="preserve">Shared interaction slope.</w:t>
-      </w:r>
-      <w:r>
-        <w:t xml:space="preserve"> </w:t>
-      </w:r>
-      <w:r>
-        <w:t xml:space="preserve">The models estimate a single climate-by-effort slope</w:t>
-      </w:r>
-      <w:r>
-        <w:t xml:space="preserve"> </w:t>
-      </w:r>
-      <w:r>
-        <w:t xml:space="preserve">across species; trait-mediated variation in dispersal, detectability and</w:t>
-      </w:r>
-      <w:r>
-        <w:t xml:space="preserve"> </w:t>
-      </w:r>
-      <w:r>
-        <w:t xml:space="preserve">thermal-niche breadth is absorbed only partly by species random intercepts. A</w:t>
-      </w:r>
-      <w:r>
-        <w:t xml:space="preserve"> </w:t>
-      </w:r>
-      <w:r>
-        <w:t xml:space="preserve">trait- or phylogeny-structured slope, and stratification by migratory strategy,</w:t>
-      </w:r>
-      <w:r>
-        <w:t xml:space="preserve"> </w:t>
-      </w:r>
-      <w:r>
-        <w:t xml:space="preserve">are natural extensions.</w:t>
-      </w:r>
-    </w:p>
-    <w:p>
-      <w:pPr>
-        <w:pStyle w:val="BodyText"/>
-      </w:pPr>
+        <w:t xml:space="preserve"> </w:t>
+      </w:r>
       <w:r>
         <w:rPr>
           <w:b/>
           <w:bCs/>
         </w:rPr>
-        <w:t xml:space="preserve">Species-pool dependence.</w:t>
-      </w:r>
-      <w:r>
-        <w:t xml:space="preserve"> </w:t>
-      </w:r>
-      <w:r>
-        <w:t xml:space="preserve">The relaxed analysis shows the relative weight of</w:t>
-      </w:r>
-      <w:r>
-        <w:t xml:space="preserve"> </w:t>
-      </w:r>
-      <w:r>
-        <w:t xml:space="preserve">interaction versus direct effort depends on how the species pool is defined; the</w:t>
-      </w:r>
-      <w:r>
-        <w:t xml:space="preserve"> </w:t>
-      </w:r>
-      <w:r>
-        <w:t xml:space="preserve">headline belongs to a well-modelled species core, not to all birds, and new</w:t>
-      </w:r>
-      <w:r>
-        <w:t xml:space="preserve"> </w:t>
-      </w:r>
-      <w:r>
-        <w:t xml:space="preserve">records mix genuine colonisers with vagrants and taxonomic revisions.</w:t>
-      </w:r>
-    </w:p>
-    <w:p>
-      <w:pPr>
-        <w:pStyle w:val="BodyText"/>
-      </w:pPr>
+        <w:t xml:space="preserve">interpolation</w:t>
+      </w:r>
+      <w:r>
+        <w:t xml:space="preserve"> </w:t>
+      </w:r>
+      <w:r>
+        <w:t xml:space="preserve">(random five-fold CV) the rich model reaches AUC = 0.73, a useful</w:t>
+      </w:r>
+      <w:r>
+        <w:t xml:space="preserve"> </w:t>
+      </w:r>
+      <w:r>
+        <w:t xml:space="preserve">gain over the two-term baseline. For</w:t>
+      </w:r>
+      <w:r>
+        <w:t xml:space="preserve"> </w:t>
+      </w:r>
       <w:r>
         <w:rPr>
           <w:b/>
           <w:bCs/>
         </w:rPr>
-        <w:t xml:space="preserve">Effort and emission scenarios.</w:t>
-      </w:r>
-      <w:r>
-        <w:t xml:space="preserve"> </w:t>
-      </w:r>
-      <w:r>
-        <w:t xml:space="preserve">The multi-scale plug-in surfaces (Figs 6–8b)</w:t>
-      </w:r>
-      <w:r>
-        <w:t xml:space="preserve"> </w:t>
-      </w:r>
-      <w:r>
-        <w:t xml:space="preserve">project a CMIP6 warming ensemble together with</w:t>
+        <w:t xml:space="preserve">temporal forecasting</w:t>
+      </w:r>
+      <w:r>
+        <w:t xml:space="preserve"> </w:t>
+      </w:r>
+      <w:r>
+        <w:t xml:space="preserve">— the axis the future</w:t>
+      </w:r>
+      <w:r>
+        <w:t xml:space="preserve"> </w:t>
+      </w:r>
+      <w:r>
+        <w:t xml:space="preserve">projections actually rely on — leave-future-out validation (train ≤ 2018, predict</w:t>
+      </w:r>
+      <w:r>
+        <w:t xml:space="preserve"> </w:t>
+      </w:r>
+      <w:r>
+        <w:t xml:space="preserve">≥ 2019) gives AUC = 0.63, i.e. usable forward discrimination. For</w:t>
       </w:r>
       <w:r>
         <w:t xml:space="preserve"> </w:t>
@@ -5686,115 +4961,758 @@
           <w:b/>
           <w:bCs/>
         </w:rPr>
-        <w:t xml:space="preserve">SSP-differentiated effort growth</w:t>
-      </w:r>
-      <w:r>
-        <w:t xml:space="preserve"> </w:t>
-      </w:r>
-      <w:r>
-        <w:t xml:space="preserve">(+0.3 SD/decade under SSP245, +0.6 under SSP585, tying citizen-science effort to</w:t>
-      </w:r>
-      <w:r>
-        <w:t xml:space="preserve"> </w:t>
-      </w:r>
-      <w:r>
-        <w:t xml:space="preserve">socioeconomic development); the province-level Figure 5 instead holds effort at</w:t>
-      </w:r>
-      <w:r>
-        <w:t xml:space="preserve"> </w:t>
-      </w:r>
-      <w:r>
-        <w:t xml:space="preserve">2024 as a conservative baseline. Effort growth is a genuine uncertainty</w:t>
-      </w:r>
-      <w:r>
-        <w:t xml:space="preserve"> </w:t>
-      </w:r>
-      <w:r>
-        <w:t xml:space="preserve">represented here by two development-linked trajectories rather than a full</w:t>
-      </w:r>
-      <w:r>
-        <w:t xml:space="preserve"> </w:t>
-      </w:r>
-      <w:r>
-        <w:t xml:space="preserve">effort-scenario ensemble; more conservative effort assumptions would keep future</w:t>
-      </w:r>
-      <w:r>
-        <w:t xml:space="preserve"> </w:t>
-      </w:r>
-      <w:r>
-        <w:t xml:space="preserve">records more concentrated in currently-surveyed regions.</w:t>
-      </w:r>
-    </w:p>
-    <w:p>
-      <w:pPr>
-        <w:pStyle w:val="BodyText"/>
-      </w:pPr>
+        <w:t xml:space="preserve">spatial</w:t>
+      </w:r>
       <w:r>
         <w:rPr>
           <w:b/>
           <w:bCs/>
         </w:rPr>
-        <w:t xml:space="preserve">Province Figure 5 frozen-effort baseline.</w:t>
-      </w:r>
-      <w:r>
-        <w:t xml:space="preserve"> </w:t>
-      </w:r>
-      <w:r>
-        <w:t xml:space="preserve">That projection holds effort at 2024 and varies only</w:t>
-      </w:r>
-      <w:r>
-        <w:t xml:space="preserve"> </w:t>
-      </w:r>
-      <w:r>
-        <w:t xml:space="preserve">climate, which is internally in tension with the paper's own thesis; we therefore</w:t>
-      </w:r>
-      <w:r>
-        <w:t xml:space="preserve"> </w:t>
-      </w:r>
-      <w:r>
-        <w:t xml:space="preserve">foreground the exposure-times-effort-gap priority surface and treat absolute</w:t>
-      </w:r>
-      <w:r>
-        <w:t xml:space="preserve"> </w:t>
-      </w:r>
-      <w:r>
-        <w:t xml:space="preserve">future maps as scenario context, not forecasts of biological change.</w:t>
-      </w:r>
-    </w:p>
-    <w:p>
-      <w:pPr>
-        <w:pStyle w:val="BodyText"/>
-      </w:pPr>
+        <w:t xml:space="preserve"> </w:t>
+      </w:r>
       <w:r>
         <w:rPr>
           <w:b/>
           <w:bCs/>
         </w:rPr>
-        <w:t xml:space="preserve">Cross-scale non-comparability.</w:t>
-      </w:r>
-      <w:r>
-        <w:t xml:space="preserve"> </w:t>
-      </w:r>
-      <w:r>
-        <w:t xml:space="preserve">Prefecture and county models use different</w:t>
-      </w:r>
-      <w:r>
-        <w:t xml:space="preserve"> </w:t>
-      </w:r>
-      <w:r>
-        <w:t xml:space="preserve">baseline rates from the province model, so absolute hazard values are not</w:t>
-      </w:r>
-      <w:r>
-        <w:t xml:space="preserve"> </w:t>
-      </w:r>
-      <w:r>
-        <w:t xml:space="preserve">comparable across scales; only the sign and relative attenuation of the</w:t>
-      </w:r>
-      <w:r>
-        <w:t xml:space="preserve"> </w:t>
-      </w:r>
-      <w:r>
-        <w:t xml:space="preserve">interaction are interpreted across scales.</w:t>
+        <w:t xml:space="preserve">extrapolation</w:t>
+      </w:r>
+      <w:r>
+        <w:t xml:space="preserve"> </w:t>
+      </w:r>
+      <w:r>
+        <w:t xml:space="preserve">to held-out 250 km province blocks, AUC is only 0.56 (≈ baseline</w:t>
+      </w:r>
+      <w:r>
+        <w:t xml:space="preserve"> </w:t>
+      </w:r>
+      <w:r>
+        <w:t xml:space="preserve">0.55) and does not improve with feature richness. The contrast is itself a result:</w:t>
+      </w:r>
+      <w:r>
+        <w:t xml:space="preserve"> </w:t>
+      </w:r>
+      <w:r>
+        <w:t xml:space="preserve">the record-generating process interpolates and forecasts adequately but does not</w:t>
+      </w:r>
+      <w:r>
+        <w:t xml:space="preserve"> </w:t>
+      </w:r>
+      <w:r>
+        <w:t xml:space="preserve">transfer across biogeographic regions, because the climate–effort–record</w:t>
+      </w:r>
+      <w:r>
+        <w:t xml:space="preserve"> </w:t>
+      </w:r>
+      <w:r>
+        <w:t xml:space="preserve">relationship is region-specific. We therefore use the framework for inference,</w:t>
+      </w:r>
+      <w:r>
+        <w:t xml:space="preserve"> </w:t>
+      </w:r>
+      <w:r>
+        <w:t xml:space="preserve">temporal projection and prioritisation logic, not for ranking unobserved regions</w:t>
+      </w:r>
+      <w:r>
+        <w:t xml:space="preserve"> </w:t>
+      </w:r>
+      <w:r>
+        <w:t xml:space="preserve">on absolute predicted hazard.</w:t>
+      </w:r>
+    </w:p>
+    <w:bookmarkEnd w:id="20"/>
+    <w:bookmarkStart w:id="21" w:name="Xf6b8a49f993c053d077250f35ee4dee86cbd481"/>
+    <w:p>
+      <w:pPr>
+        <w:pStyle w:val="Heading3"/>
+      </w:pPr>
+      <w:r>
+        <w:t xml:space="preserve">Scenario-based future hazard and the priority surface it implies</w:t>
+      </w:r>
+    </w:p>
+    <w:p>
+      <w:pPr>
+        <w:pStyle w:val="FirstParagraph"/>
+      </w:pPr>
+      <w:r>
+        <w:t xml:space="preserve">Projecting the fitted province relationship forward under CMIP6 climate</w:t>
+      </w:r>
+      <w:r>
+        <w:t xml:space="preserve"> </w:t>
+      </w:r>
+      <w:r>
+        <w:t xml:space="preserve">trajectories (effort held at its 2024 level), mean province hazard rose under</w:t>
+      </w:r>
+      <w:r>
+        <w:t xml:space="preserve"> </w:t>
+      </w:r>
+      <w:r>
+        <w:t xml:space="preserve">both shared socioeconomic pathways and most steeply under SSP585, from 0.087 in</w:t>
+      </w:r>
+      <w:r>
+        <w:t xml:space="preserve"> </w:t>
+      </w:r>
+      <w:r>
+        <w:t xml:space="preserve">2030 to 0.308 in 2050 and 0.760 in 2080 (versus 0.067, 0.111 and 0.230 under</w:t>
+      </w:r>
+      <w:r>
+        <w:t xml:space="preserve"> </w:t>
+      </w:r>
+      <w:r>
+        <w:t xml:space="preserve">SSP245). The highest SSP585-2050 hazards fell in eastern, high-effort provinces —</w:t>
+      </w:r>
+      <w:r>
+        <w:t xml:space="preserve"> </w:t>
+      </w:r>
+      <w:r>
+        <w:t xml:space="preserve">Jiangsu (0.76), Zhejiang (0.73), Hubei (0.61), Fujian (0.49) and Henan (0.48).</w:t>
+      </w:r>
+    </w:p>
+    <w:p>
+      <w:pPr>
+        <w:pStyle w:val="BodyText"/>
+      </w:pPr>
+      <w:r>
+        <w:t xml:space="preserve">This eastern concentration is, by construction, partly a restatement of the</w:t>
+      </w:r>
+      <w:r>
+        <w:t xml:space="preserve"> </w:t>
+      </w:r>
+      <w:r>
+        <w:t xml:space="preserve">current effort map: because the model is multiplicative and effort is frozen at</w:t>
+      </w:r>
+      <w:r>
+        <w:t xml:space="preserve"> </w:t>
+      </w:r>
+      <w:r>
+        <w:t xml:space="preserve">its 2024 (high-in-the-east) values, the provinces that already record the most</w:t>
+      </w:r>
+      <w:r>
+        <w:t xml:space="preserve"> </w:t>
+      </w:r>
+      <w:r>
+        <w:t xml:space="preserve">will also be projected to</w:t>
+      </w:r>
+      <w:r>
+        <w:t xml:space="preserve"> </w:t>
+      </w:r>
+      <w:r>
+        <w:rPr>
+          <w:i/>
+          <w:iCs/>
+        </w:rPr>
+        <w:t xml:space="preserve">see</w:t>
+      </w:r>
+      <w:r>
+        <w:t xml:space="preserve"> </w:t>
+      </w:r>
+      <w:r>
+        <w:t xml:space="preserve">the most. The absolute hazard surface therefore</w:t>
+      </w:r>
+      <w:r>
+        <w:t xml:space="preserve"> </w:t>
+      </w:r>
+      <w:r>
+        <w:t xml:space="preserve">answers "where will new records appear under continued observation," not "where</w:t>
+      </w:r>
+      <w:r>
+        <w:t xml:space="preserve"> </w:t>
+      </w:r>
+      <w:r>
+        <w:t xml:space="preserve">will range change occur." The decision-relevant quantity is different and is the</w:t>
+      </w:r>
+      <w:r>
+        <w:t xml:space="preserve"> </w:t>
+      </w:r>
+      <w:r>
+        <w:t xml:space="preserve">one we recommend acting on: the product of projected climatic exposure and the</w:t>
+      </w:r>
+      <w:r>
+        <w:t xml:space="preserve"> </w:t>
+      </w:r>
+      <w:r>
+        <w:rPr>
+          <w:i/>
+          <w:iCs/>
+        </w:rPr>
+        <w:t xml:space="preserve">current effort gap</w:t>
+      </w:r>
+      <w:r>
+        <w:t xml:space="preserve">. Units that combine high future exposure with low present</w:t>
+      </w:r>
+      <w:r>
+        <w:t xml:space="preserve"> </w:t>
+      </w:r>
+      <w:r>
+        <w:t xml:space="preserve">effort are where modest survey investment most converts latent redistribution</w:t>
+      </w:r>
+      <w:r>
+        <w:t xml:space="preserve"> </w:t>
+      </w:r>
+      <w:r>
+        <w:t xml:space="preserve">into evidence; they are systematically not the eastern provinces that dominate the</w:t>
+      </w:r>
+      <w:r>
+        <w:t xml:space="preserve"> </w:t>
+      </w:r>
+      <w:r>
+        <w:t xml:space="preserve">raw hazard surface. We therefore present the absolute maps as scenario context and</w:t>
+      </w:r>
+      <w:r>
+        <w:t xml:space="preserve"> </w:t>
+      </w:r>
+      <w:r>
+        <w:t xml:space="preserve">the exposure-times-effort-gap surface as the operational recommendation, and we</w:t>
+      </w:r>
+      <w:r>
+        <w:t xml:space="preserve"> </w:t>
+      </w:r>
+      <w:r>
+        <w:t xml:space="preserve">treat explicit effort-growth scenarios as a method-ready extension rather than</w:t>
+      </w:r>
+      <w:r>
+        <w:t xml:space="preserve"> </w:t>
+      </w:r>
+      <w:r>
+        <w:t xml:space="preserve">reporting frozen-effort absolute maps as forecasts of biological change.</w:t>
+      </w:r>
+    </w:p>
+    <w:bookmarkEnd w:id="21"/>
+    <w:bookmarkEnd w:id="22"/>
+    <w:bookmarkStart w:id="30" w:name="discussion"/>
+    <w:p>
+      <w:pPr>
+        <w:pStyle w:val="Heading2"/>
+      </w:pPr>
+      <w:r>
+        <w:t xml:space="preserve">Discussion</w:t>
+      </w:r>
+    </w:p>
+    <w:bookmarkStart w:id="23" w:name="X4278a7fd1464437e46d61cb567f6129aff378bb"/>
+    <w:p>
+      <w:pPr>
+        <w:pStyle w:val="Heading3"/>
+      </w:pPr>
+      <w:r>
+        <w:t xml:space="preserve">Effort as a visibility moderator reframes the new record</w:t>
+      </w:r>
+    </w:p>
+    <w:p>
+      <w:pPr>
+        <w:pStyle w:val="FirstParagraph"/>
+      </w:pPr>
+      <w:r>
+        <w:t xml:space="preserve">The data support a specific and, we think, consequential reading of new</w:t>
+      </w:r>
+      <w:r>
+        <w:t xml:space="preserve"> </w:t>
+      </w:r>
+      <w:r>
+        <w:t xml:space="preserve">distribution records: they are effort-moderated visibility events. The</w:t>
+      </w:r>
+      <w:r>
+        <w:t xml:space="preserve"> </w:t>
+      </w:r>
+      <w:r>
+        <w:t xml:space="preserve">climate-by-effort interaction was positive and decisively supported over the</w:t>
+      </w:r>
+      <w:r>
+        <w:t xml:space="preserve"> </w:t>
+      </w:r>
+      <w:r>
+        <w:t xml:space="preserve">additive model under every effort metric; the direct interaction-versus-offset</w:t>
+      </w:r>
+      <w:r>
+        <w:t xml:space="preserve"> </w:t>
+      </w:r>
+      <w:r>
+        <w:t xml:space="preserve">test identified effort as a moderator of the climate-hazard slope rather than a</w:t>
+      </w:r>
+      <w:r>
+        <w:t xml:space="preserve"> </w:t>
+      </w:r>
+      <w:r>
+        <w:t xml:space="preserve">multiplicative scaling of records; and the interaction persisted, slightly</w:t>
+      </w:r>
+      <w:r>
+        <w:t xml:space="preserve"> </w:t>
+      </w:r>
+      <w:r>
+        <w:t xml:space="preserve">strengthened, when effort was measured a year before the event, which orders the</w:t>
+      </w:r>
+      <w:r>
+        <w:t xml:space="preserve"> </w:t>
+      </w:r>
+      <w:r>
+        <w:t xml:space="preserve">two temporally as moderation predicts and weakens the reverse-causation</w:t>
+      </w:r>
+      <w:r>
+        <w:t xml:space="preserve"> </w:t>
+      </w:r>
+      <w:r>
+        <w:t xml:space="preserve">alternative. High climatic exposure without sufficient</w:t>
+      </w:r>
+      <w:r>
+        <w:t xml:space="preserve"> </w:t>
+      </w:r>
+      <w:r>
+        <w:t xml:space="preserve">survey effort stays unseen; high effort in climatically exposed places turns</w:t>
+      </w:r>
+      <w:r>
+        <w:t xml:space="preserve"> </w:t>
+      </w:r>
+      <w:r>
+        <w:t xml:space="preserve">redistribution into a recorded event. Treating effort only as an additive</w:t>
+      </w:r>
+      <w:r>
+        <w:t xml:space="preserve"> </w:t>
+      </w:r>
+      <w:r>
+        <w:t xml:space="preserve">nuisance or an offset, the two most common corrections in the literature,</w:t>
+      </w:r>
+      <w:r>
+        <w:t xml:space="preserve"> </w:t>
+      </w:r>
+      <w:r>
+        <w:t xml:space="preserve">therefore mis-specifies the record-generating process in a direction that biases</w:t>
+      </w:r>
+      <w:r>
+        <w:t xml:space="preserve"> </w:t>
+      </w:r>
+      <w:r>
+        <w:t xml:space="preserve">range-shift inference toward well-surveyed landscapes.</w:t>
+      </w:r>
+    </w:p>
+    <w:p>
+      <w:pPr>
+        <w:pStyle w:val="BodyText"/>
+      </w:pPr>
+      <w:r>
+        <w:t xml:space="preserve">The interaction-versus-offset comparison deserves emphasis as a reusable tool.</w:t>
+      </w:r>
+      <w:r>
+        <w:t xml:space="preserve"> </w:t>
+      </w:r>
+      <w:r>
+        <w:t xml:space="preserve">Much of biodiversity informatics corrects for effort by including it as a</w:t>
+      </w:r>
+      <w:r>
+        <w:t xml:space="preserve"> </w:t>
+      </w:r>
+      <w:r>
+        <w:t xml:space="preserve">covariate or offset and then proceeds as if the climate signal has been</w:t>
+      </w:r>
+      <w:r>
+        <w:t xml:space="preserve"> </w:t>
+      </w:r>
+      <w:r>
+        <w:t xml:space="preserve">cleansed. Our result shows that this step is itself a testable hypothesis: where</w:t>
+      </w:r>
+      <w:r>
+        <w:t xml:space="preserve"> </w:t>
+      </w:r>
+      <w:r>
+        <w:t xml:space="preserve">the offset model loses decisively to the interaction model, effort is doing more</w:t>
+      </w:r>
+      <w:r>
+        <w:t xml:space="preserve"> </w:t>
+      </w:r>
+      <w:r>
+        <w:t xml:space="preserve">than scaling, and the "corrected" climate signal is conditional on observation</w:t>
+      </w:r>
+      <w:r>
+        <w:t xml:space="preserve"> </w:t>
+      </w:r>
+      <w:r>
+        <w:t xml:space="preserve">intensity. The comparison is cheap to run and we suggest it be reported routinely</w:t>
+      </w:r>
+      <w:r>
+        <w:t xml:space="preserve"> </w:t>
+      </w:r>
+      <w:r>
+        <w:t xml:space="preserve">whenever effort is modelled.</w:t>
+      </w:r>
+    </w:p>
+    <w:bookmarkEnd w:id="23"/>
+    <w:bookmarkStart w:id="24" w:name="X41bc338843b808c8be925140991f92cf50206b6"/>
+    <w:p>
+      <w:pPr>
+        <w:pStyle w:val="Heading3"/>
+      </w:pPr>
+      <w:r>
+        <w:t xml:space="preserve">The robustness boundary is part of the result</w:t>
+      </w:r>
+    </w:p>
+    <w:p>
+      <w:pPr>
+        <w:pStyle w:val="FirstParagraph"/>
+      </w:pPr>
+      <w:r>
+        <w:t xml:space="preserve">Expanding the risk set fifteen-fold preserved the province-scale interaction and</w:t>
+      </w:r>
+      <w:r>
+        <w:t xml:space="preserve"> </w:t>
+      </w:r>
+      <w:r>
+        <w:t xml:space="preserve">sharpened its significance, which rules out the conservative SDM filter as the</w:t>
+      </w:r>
+      <w:r>
+        <w:t xml:space="preserve"> </w:t>
+      </w:r>
+      <w:r>
+        <w:t xml:space="preserve">source of the effect. The same expansion dissolved the interaction at finer</w:t>
+      </w:r>
+      <w:r>
+        <w:t xml:space="preserve"> </w:t>
+      </w:r>
+      <w:r>
+        <w:t xml:space="preserve">scales and demoted it in machine-learning importance, because the added species</w:t>
+      </w:r>
+      <w:r>
+        <w:t xml:space="preserve"> </w:t>
+      </w:r>
+      <w:r>
+        <w:t xml:space="preserve">are dominated by effort-density discovery rather than climate-effort moderation.</w:t>
+      </w:r>
+      <w:r>
+        <w:t xml:space="preserve"> </w:t>
+      </w:r>
+      <w:r>
+        <w:t xml:space="preserve">Rather than averaging these regimes into a single weaker estimate, the framework</w:t>
+      </w:r>
+      <w:r>
+        <w:t xml:space="preserve"> </w:t>
+      </w:r>
+      <w:r>
+        <w:t xml:space="preserve">locates the boundary between them. For a well-modelled species core the</w:t>
+      </w:r>
+      <w:r>
+        <w:t xml:space="preserve"> </w:t>
+      </w:r>
+      <w:r>
+        <w:t xml:space="preserve">visibility mechanism is climate-effort interaction; for the long tail of</w:t>
+      </w:r>
+      <w:r>
+        <w:t xml:space="preserve"> </w:t>
+      </w:r>
+      <w:r>
+        <w:t xml:space="preserve">SDM-borderline and rare taxa it is raw effort. Conservation and macroecological</w:t>
+      </w:r>
+      <w:r>
+        <w:t xml:space="preserve"> </w:t>
+      </w:r>
+      <w:r>
+        <w:t xml:space="preserve">applications that pool all species risk diluting a real mechanism with a</w:t>
+      </w:r>
+      <w:r>
+        <w:t xml:space="preserve"> </w:t>
+      </w:r>
+      <w:r>
+        <w:t xml:space="preserve">different one, and should report results for the core and the tail separately.</w:t>
+      </w:r>
+    </w:p>
+    <w:bookmarkEnd w:id="24"/>
+    <w:bookmarkStart w:id="25" w:name="scale-attenuation-without-reversal"/>
+    <w:p>
+      <w:pPr>
+        <w:pStyle w:val="Heading3"/>
+      </w:pPr>
+      <w:r>
+        <w:t xml:space="preserve">Scale attenuation without reversal</w:t>
+      </w:r>
+    </w:p>
+    <w:p>
+      <w:pPr>
+        <w:pStyle w:val="FirstParagraph"/>
+      </w:pPr>
+      <w:r>
+        <w:t xml:space="preserve">The province-to-county attenuation in the conservative analysis is consistent</w:t>
+      </w:r>
+      <w:r>
+        <w:t xml:space="preserve"> </w:t>
+      </w:r>
+      <w:r>
+        <w:t xml:space="preserve">with a signal carried partly by broad gradients in climatic exposure and survey</w:t>
+      </w:r>
+      <w:r>
+        <w:t xml:space="preserve"> </w:t>
+      </w:r>
+      <w:r>
+        <w:t xml:space="preserve">infrastructure. Finer administrative units fragment events, raise local</w:t>
+      </w:r>
+      <w:r>
+        <w:t xml:space="preserve"> </w:t>
+      </w:r>
+      <w:r>
+        <w:t xml:space="preserve">heterogeneity and shrink the estimable interaction, but the sign is preserved</w:t>
+      </w:r>
+      <w:r>
+        <w:t xml:space="preserve"> </w:t>
+      </w:r>
+      <w:r>
+        <w:t xml:space="preserve">and the interaction model remains preferred at every scale. This is a textbook</w:t>
+      </w:r>
+      <w:r>
+        <w:t xml:space="preserve"> </w:t>
+      </w:r>
+      <w:r>
+        <w:t xml:space="preserve">modifiable-areal-unit pattern (Openshaw 1984) acting on effect size, and it cautions against</w:t>
+      </w:r>
+      <w:r>
+        <w:t xml:space="preserve"> </w:t>
+      </w:r>
+      <w:r>
+        <w:t xml:space="preserve">reading the loss of significance at county scale as evidence against the</w:t>
+      </w:r>
+      <w:r>
+        <w:t xml:space="preserve"> </w:t>
+      </w:r>
+      <w:r>
+        <w:t xml:space="preserve">mechanism. It also cautions against the opposite error — proxying coarse climate</w:t>
+      </w:r>
+      <w:r>
+        <w:t xml:space="preserve"> </w:t>
+      </w:r>
+      <w:r>
+        <w:t xml:space="preserve">or effort onto fine grids, which manufactures apparent fine-scale signal from</w:t>
+      </w:r>
+      <w:r>
+        <w:t xml:space="preserve"> </w:t>
+      </w:r>
+      <w:r>
+        <w:t xml:space="preserve">aggregate gradients. Genuine fine-scale inference requires fine-scale</w:t>
+      </w:r>
+      <w:r>
+        <w:t xml:space="preserve"> </w:t>
+      </w:r>
+      <w:r>
+        <w:t xml:space="preserve">covariates, which is why our prefecture and county refits draw effort from raw</w:t>
+      </w:r>
+      <w:r>
+        <w:t xml:space="preserve"> </w:t>
+      </w:r>
+      <w:r>
+        <w:t xml:space="preserve">geolocated records rather than from province broadcasts.</w:t>
+      </w:r>
+    </w:p>
+    <w:bookmarkEnd w:id="25"/>
+    <w:bookmarkStart w:id="26" w:name="X37055fb27accea50bb61665d21b7429344146cc"/>
+    <w:p>
+      <w:pPr>
+        <w:pStyle w:val="Heading3"/>
+      </w:pPr>
+      <w:r>
+        <w:t xml:space="preserve">Implications for monitoring under climate change</w:t>
+      </w:r>
+    </w:p>
+    <w:p>
+      <w:pPr>
+        <w:pStyle w:val="FirstParagraph"/>
+      </w:pPr>
+      <w:r>
+        <w:t xml:space="preserve">If new records are effort-moderated visibility events, then raw projected hazard</w:t>
+      </w:r>
+      <w:r>
+        <w:t xml:space="preserve"> </w:t>
+      </w:r>
+      <w:r>
+        <w:t xml:space="preserve">is a poor guide to where survey investment is most valuable. Our province</w:t>
+      </w:r>
+      <w:r>
+        <w:t xml:space="preserve"> </w:t>
+      </w:r>
+      <w:r>
+        <w:t xml:space="preserve">projections concentrate future hazard in eastern, high-effort provinces — places</w:t>
+      </w:r>
+      <w:r>
+        <w:t xml:space="preserve"> </w:t>
+      </w:r>
+      <w:r>
+        <w:t xml:space="preserve">where the model expects climatic exposure to become highly</w:t>
+      </w:r>
+      <w:r>
+        <w:t xml:space="preserve"> </w:t>
+      </w:r>
+      <w:r>
+        <w:rPr>
+          <w:i/>
+          <w:iCs/>
+        </w:rPr>
+        <w:t xml:space="preserve">visible</w:t>
+      </w:r>
+      <w:r>
+        <w:t xml:space="preserve"> </w:t>
+      </w:r>
+      <w:r>
+        <w:t xml:space="preserve">under</w:t>
+      </w:r>
+      <w:r>
+        <w:t xml:space="preserve"> </w:t>
+      </w:r>
+      <w:r>
+        <w:t xml:space="preserve">existing effort, not necessarily where range change is most novel. Allocating</w:t>
+      </w:r>
+      <w:r>
+        <w:t xml:space="preserve"> </w:t>
+      </w:r>
+      <w:r>
+        <w:t xml:space="preserve">effort to these provinces maximises the rate of new records but adds little to</w:t>
+      </w:r>
+      <w:r>
+        <w:t xml:space="preserve"> </w:t>
+      </w:r>
+      <w:r>
+        <w:t xml:space="preserve">what is already well observed. The more informative targets are units where high</w:t>
+      </w:r>
+      <w:r>
+        <w:t xml:space="preserve"> </w:t>
+      </w:r>
+      <w:r>
+        <w:t xml:space="preserve">projected climatic exposure coincides with a current effort gap: there, modest</w:t>
+      </w:r>
+      <w:r>
+        <w:t xml:space="preserve"> </w:t>
+      </w:r>
+      <w:r>
+        <w:t xml:space="preserve">additional effort converts latent redistribution into evidence and most reduces</w:t>
+      </w:r>
+      <w:r>
+        <w:t xml:space="preserve"> </w:t>
+      </w:r>
+      <w:r>
+        <w:t xml:space="preserve">uncertainty. We therefore recommend prioritising on the product of climatic</w:t>
+      </w:r>
+      <w:r>
+        <w:t xml:space="preserve"> </w:t>
+      </w:r>
+      <w:r>
+        <w:t xml:space="preserve">exposure and effort deficit, and reporting forecast uncertainty alongside the</w:t>
+      </w:r>
+      <w:r>
+        <w:t xml:space="preserve"> </w:t>
+      </w:r>
+      <w:r>
+        <w:t xml:space="preserve">point hazard, rather than ranking units on projected hazard alone.</w:t>
+      </w:r>
+    </w:p>
+    <w:bookmarkEnd w:id="26"/>
+    <w:bookmarkStart w:id="27" w:name="generality-beyond-birds-in-china"/>
+    <w:p>
+      <w:pPr>
+        <w:pStyle w:val="Heading3"/>
+      </w:pPr>
+      <w:r>
+        <w:t xml:space="preserve">Generality beyond birds in China</w:t>
+      </w:r>
+    </w:p>
+    <w:p>
+      <w:pPr>
+        <w:pStyle w:val="FirstParagraph"/>
+      </w:pPr>
+      <w:r>
+        <w:t xml:space="preserve">We demonstrate the framework on one taxon in one country, but neither the</w:t>
+      </w:r>
+      <w:r>
+        <w:t xml:space="preserve"> </w:t>
+      </w:r>
+      <w:r>
+        <w:t xml:space="preserve">mechanism nor the method is China- or bird-specific. The visibility argument —</w:t>
+      </w:r>
+      <w:r>
+        <w:t xml:space="preserve"> </w:t>
+      </w:r>
+      <w:r>
+        <w:t xml:space="preserve">that a record requires ecological exposure and observation to coincide</w:t>
+      </w:r>
+      <w:r>
+        <w:t xml:space="preserve"> </w:t>
+      </w:r>
+      <w:r>
+        <w:t xml:space="preserve">multiplicatively — applies wherever occurrence data are assembled under uneven and</w:t>
+      </w:r>
+      <w:r>
+        <w:t xml:space="preserve"> </w:t>
+      </w:r>
+      <w:r>
+        <w:t xml:space="preserve">growing effort, which is to say essentially all biodiversity informatics. The two</w:t>
+      </w:r>
+      <w:r>
+        <w:t xml:space="preserve"> </w:t>
+      </w:r>
+      <w:r>
+        <w:t xml:space="preserve">transferable contributions are method-level and travel directly: the</w:t>
+      </w:r>
+      <w:r>
+        <w:t xml:space="preserve"> </w:t>
+      </w:r>
+      <w:r>
+        <w:t xml:space="preserve">discrete-time hazard formulation of "new records," and the interaction-versus-offset</w:t>
+      </w:r>
+      <w:r>
+        <w:t xml:space="preserve"> </w:t>
+      </w:r>
+      <w:r>
+        <w:t xml:space="preserve">test that distinguishes effort-as-moderator from effort-as-scaling. China and</w:t>
+      </w:r>
+      <w:r>
+        <w:t xml:space="preserve"> </w:t>
+      </w:r>
+      <w:r>
+        <w:t xml:space="preserve">birds are a demanding rather than a convenient case, combining steep climatic</w:t>
+      </w:r>
+      <w:r>
+        <w:t xml:space="preserve"> </w:t>
+      </w:r>
+      <w:r>
+        <w:t xml:space="preserve">gradients with order-of-magnitude effort growth, so a positive result here is</w:t>
+      </w:r>
+      <w:r>
+        <w:t xml:space="preserve"> </w:t>
+      </w:r>
+      <w:r>
+        <w:t xml:space="preserve">informative about the general phenomenon. We nonetheless treat broad generality as</w:t>
+      </w:r>
+      <w:r>
+        <w:t xml:space="preserve"> </w:t>
+      </w:r>
+      <w:r>
+        <w:t xml:space="preserve">a hypothesis to be tested: the natural next steps are replication in a second</w:t>
+      </w:r>
+      <w:r>
+        <w:t xml:space="preserve"> </w:t>
+      </w:r>
+      <w:r>
+        <w:t xml:space="preserve">taxon with contrasting detectability (for example plants or insects) and in a</w:t>
+      </w:r>
+      <w:r>
+        <w:t xml:space="preserve"> </w:t>
+      </w:r>
+      <w:r>
+        <w:t xml:space="preserve">region with a different effort trajectory, which we flag as a pre-registered</w:t>
+      </w:r>
+      <w:r>
+        <w:t xml:space="preserve"> </w:t>
+      </w:r>
+      <w:r>
+        <w:t xml:space="preserve">extension rather than a claim made here.</w:t>
+      </w:r>
+    </w:p>
+    <w:bookmarkEnd w:id="27"/>
+    <w:bookmarkStart w:id="28" w:name="limitations"/>
+    <w:p>
+      <w:pPr>
+        <w:pStyle w:val="Heading3"/>
+      </w:pPr>
+      <w:r>
+        <w:t xml:space="preserve">Limitations</w:t>
+      </w:r>
+    </w:p>
+    <w:p>
+      <w:pPr>
+        <w:pStyle w:val="FirstParagraph"/>
+      </w:pPr>
+      <w:r>
+        <w:t xml:space="preserve">Six limitations bound these conclusions, and we state the most serious first.</w:t>
       </w:r>
     </w:p>
     <w:p>
@@ -5806,6 +5724,322 @@
           <w:b/>
           <w:bCs/>
         </w:rPr>
+        <w:t xml:space="preserve">Endogeneity of effort.</w:t>
+      </w:r>
+      <w:r>
+        <w:t xml:space="preserve"> </w:t>
+      </w:r>
+      <w:r>
+        <w:t xml:space="preserve">Effort is not strictly exogenous: observers</w:t>
+      </w:r>
+      <w:r>
+        <w:t xml:space="preserve"> </w:t>
+      </w:r>
+      <w:r>
+        <w:t xml:space="preserve">preferentially visit places with recent notable records, and a new record can</w:t>
+      </w:r>
+      <w:r>
+        <w:t xml:space="preserve"> </w:t>
+      </w:r>
+      <w:r>
+        <w:t xml:space="preserve">attract subsequent effort. We addressed the simplest form of this — concurrent</w:t>
+      </w:r>
+      <w:r>
+        <w:t xml:space="preserve"> </w:t>
+      </w:r>
+      <w:r>
+        <w:t xml:space="preserve">reverse causation — with the one-year effort lag, which preserved the interaction</w:t>
+      </w:r>
+      <w:r>
+        <w:t xml:space="preserve"> </w:t>
+      </w:r>
+      <w:r>
+        <w:t xml:space="preserve">(Table 3); effort measured before the event year cannot respond to that event.</w:t>
+      </w:r>
+      <w:r>
+        <w:t xml:space="preserve"> </w:t>
+      </w:r>
+      <w:r>
+        <w:t xml:space="preserve">What the lag does not remove is confounding from slow-moving, unmeasured</w:t>
+      </w:r>
+      <w:r>
+        <w:t xml:space="preserve"> </w:t>
+      </w:r>
+      <w:r>
+        <w:t xml:space="preserve">province-level traits that make a region simultaneously well-watched and</w:t>
+      </w:r>
+      <w:r>
+        <w:t xml:space="preserve"> </w:t>
+      </w:r>
+      <w:r>
+        <w:t xml:space="preserve">climatically dynamic. Stronger identification would come from an external</w:t>
+      </w:r>
+      <w:r>
+        <w:t xml:space="preserve"> </w:t>
+      </w:r>
+      <w:r>
+        <w:t xml:space="preserve">instrument for effort (e.g. human-population or road density) or a</w:t>
+      </w:r>
+      <w:r>
+        <w:t xml:space="preserve"> </w:t>
+      </w:r>
+      <w:r>
+        <w:t xml:space="preserve">quasi-experiment in effort allocation; we regard the lag as a strong but not</w:t>
+      </w:r>
+      <w:r>
+        <w:t xml:space="preserve"> </w:t>
+      </w:r>
+      <w:r>
+        <w:t xml:space="preserve">complete defense and retain "moderator" as a statement about the record-generating</w:t>
+      </w:r>
+      <w:r>
+        <w:t xml:space="preserve"> </w:t>
+      </w:r>
+      <w:r>
+        <w:t xml:space="preserve">model that is now also temporally ordered, while flagging full causal</w:t>
+      </w:r>
+      <w:r>
+        <w:t xml:space="preserve"> </w:t>
+      </w:r>
+      <w:r>
+        <w:t xml:space="preserve">identification as open.</w:t>
+      </w:r>
+    </w:p>
+    <w:p>
+      <w:pPr>
+        <w:pStyle w:val="BodyText"/>
+      </w:pPr>
+      <w:r>
+        <w:rPr>
+          <w:b/>
+          <w:bCs/>
+        </w:rPr>
+        <w:t xml:space="preserve">Interaction slope varies by trait.</w:t>
+      </w:r>
+      <w:r>
+        <w:t xml:space="preserve"> </w:t>
+      </w:r>
+      <w:r>
+        <w:t xml:space="preserve">The headline model estimates one</w:t>
+      </w:r>
+      <w:r>
+        <w:t xml:space="preserve"> </w:t>
+      </w:r>
+      <w:r>
+        <w:t xml:space="preserve">climate-by-effort slope across species; we partly relaxed this by stratifying on</w:t>
+      </w:r>
+      <w:r>
+        <w:t xml:space="preserve"> </w:t>
+      </w:r>
+      <w:r>
+        <w:t xml:space="preserve">migratory strategy (Fig. 9a), which showed the interaction is general but</w:t>
+      </w:r>
+      <w:r>
+        <w:t xml:space="preserve"> </w:t>
+      </w:r>
+      <w:r>
+        <w:t xml:space="preserve">strongest in residents (HR = 1.43) and weaker in migrants (≈ 1.25). Finer</w:t>
+      </w:r>
+      <w:r>
+        <w:t xml:space="preserve"> </w:t>
+      </w:r>
+      <w:r>
+        <w:t xml:space="preserve">trait- or phylogeny-structured slopes remain a natural extension, and the residual</w:t>
+      </w:r>
+      <w:r>
+        <w:t xml:space="preserve"> </w:t>
+      </w:r>
+      <w:r>
+        <w:t xml:space="preserve">movement/stochastic component of vagrant occurrences is not explicitly modelled.</w:t>
+      </w:r>
+    </w:p>
+    <w:p>
+      <w:pPr>
+        <w:pStyle w:val="BodyText"/>
+      </w:pPr>
+      <w:r>
+        <w:rPr>
+          <w:b/>
+          <w:bCs/>
+        </w:rPr>
+        <w:t xml:space="preserve">Species-pool dependence.</w:t>
+      </w:r>
+      <w:r>
+        <w:t xml:space="preserve"> </w:t>
+      </w:r>
+      <w:r>
+        <w:t xml:space="preserve">The relaxed analysis shows the relative weight of</w:t>
+      </w:r>
+      <w:r>
+        <w:t xml:space="preserve"> </w:t>
+      </w:r>
+      <w:r>
+        <w:t xml:space="preserve">interaction versus direct effort depends on how the species pool is defined; the</w:t>
+      </w:r>
+      <w:r>
+        <w:t xml:space="preserve"> </w:t>
+      </w:r>
+      <w:r>
+        <w:t xml:space="preserve">headline belongs to a well-modelled species core, not to all birds, and new</w:t>
+      </w:r>
+      <w:r>
+        <w:t xml:space="preserve"> </w:t>
+      </w:r>
+      <w:r>
+        <w:t xml:space="preserve">records mix genuine colonisers with vagrants and taxonomic revisions.</w:t>
+      </w:r>
+    </w:p>
+    <w:p>
+      <w:pPr>
+        <w:pStyle w:val="BodyText"/>
+      </w:pPr>
+      <w:r>
+        <w:rPr>
+          <w:b/>
+          <w:bCs/>
+        </w:rPr>
+        <w:t xml:space="preserve">Effort and emission scenarios.</w:t>
+      </w:r>
+      <w:r>
+        <w:t xml:space="preserve"> </w:t>
+      </w:r>
+      <w:r>
+        <w:t xml:space="preserve">The multi-scale plug-in surfaces (Figs 6–8b)</w:t>
+      </w:r>
+      <w:r>
+        <w:t xml:space="preserve"> </w:t>
+      </w:r>
+      <w:r>
+        <w:t xml:space="preserve">project a CMIP6 warming ensemble together with</w:t>
+      </w:r>
+      <w:r>
+        <w:t xml:space="preserve"> </w:t>
+      </w:r>
+      <w:r>
+        <w:rPr>
+          <w:b/>
+          <w:bCs/>
+        </w:rPr>
+        <w:t xml:space="preserve">SSP-differentiated effort growth</w:t>
+      </w:r>
+      <w:r>
+        <w:t xml:space="preserve"> </w:t>
+      </w:r>
+      <w:r>
+        <w:t xml:space="preserve">(+0.3 SD/decade under SSP245, +0.6 under SSP585, tying citizen-science effort to</w:t>
+      </w:r>
+      <w:r>
+        <w:t xml:space="preserve"> </w:t>
+      </w:r>
+      <w:r>
+        <w:t xml:space="preserve">socioeconomic development); the province-level Figure 5 instead holds effort at</w:t>
+      </w:r>
+      <w:r>
+        <w:t xml:space="preserve"> </w:t>
+      </w:r>
+      <w:r>
+        <w:t xml:space="preserve">2024 as a conservative baseline. Effort growth is a genuine uncertainty</w:t>
+      </w:r>
+      <w:r>
+        <w:t xml:space="preserve"> </w:t>
+      </w:r>
+      <w:r>
+        <w:t xml:space="preserve">represented here by two development-linked trajectories rather than a full</w:t>
+      </w:r>
+      <w:r>
+        <w:t xml:space="preserve"> </w:t>
+      </w:r>
+      <w:r>
+        <w:t xml:space="preserve">effort-scenario ensemble; more conservative effort assumptions would keep future</w:t>
+      </w:r>
+      <w:r>
+        <w:t xml:space="preserve"> </w:t>
+      </w:r>
+      <w:r>
+        <w:t xml:space="preserve">records more concentrated in currently-surveyed regions.</w:t>
+      </w:r>
+    </w:p>
+    <w:p>
+      <w:pPr>
+        <w:pStyle w:val="BodyText"/>
+      </w:pPr>
+      <w:r>
+        <w:rPr>
+          <w:b/>
+          <w:bCs/>
+        </w:rPr>
+        <w:t xml:space="preserve">Province Figure 5 frozen-effort baseline.</w:t>
+      </w:r>
+      <w:r>
+        <w:t xml:space="preserve"> </w:t>
+      </w:r>
+      <w:r>
+        <w:t xml:space="preserve">That projection holds effort at 2024 and varies only</w:t>
+      </w:r>
+      <w:r>
+        <w:t xml:space="preserve"> </w:t>
+      </w:r>
+      <w:r>
+        <w:t xml:space="preserve">climate, which is internally in tension with the paper's own thesis; we therefore</w:t>
+      </w:r>
+      <w:r>
+        <w:t xml:space="preserve"> </w:t>
+      </w:r>
+      <w:r>
+        <w:t xml:space="preserve">foreground the exposure-times-effort-gap priority surface and treat absolute</w:t>
+      </w:r>
+      <w:r>
+        <w:t xml:space="preserve"> </w:t>
+      </w:r>
+      <w:r>
+        <w:t xml:space="preserve">future maps as scenario context, not forecasts of biological change.</w:t>
+      </w:r>
+    </w:p>
+    <w:p>
+      <w:pPr>
+        <w:pStyle w:val="BodyText"/>
+      </w:pPr>
+      <w:r>
+        <w:rPr>
+          <w:b/>
+          <w:bCs/>
+        </w:rPr>
+        <w:t xml:space="preserve">Cross-scale non-comparability.</w:t>
+      </w:r>
+      <w:r>
+        <w:t xml:space="preserve"> </w:t>
+      </w:r>
+      <w:r>
+        <w:t xml:space="preserve">Prefecture and county models use different</w:t>
+      </w:r>
+      <w:r>
+        <w:t xml:space="preserve"> </w:t>
+      </w:r>
+      <w:r>
+        <w:t xml:space="preserve">baseline rates from the province model, so absolute hazard values are not</w:t>
+      </w:r>
+      <w:r>
+        <w:t xml:space="preserve"> </w:t>
+      </w:r>
+      <w:r>
+        <w:t xml:space="preserve">comparable across scales; only the sign and relative attenuation of the</w:t>
+      </w:r>
+      <w:r>
+        <w:t xml:space="preserve"> </w:t>
+      </w:r>
+      <w:r>
+        <w:t xml:space="preserve">interaction are interpreted across scales.</w:t>
+      </w:r>
+    </w:p>
+    <w:p>
+      <w:pPr>
+        <w:pStyle w:val="BodyText"/>
+      </w:pPr>
+      <w:r>
+        <w:rPr>
+          <w:b/>
+          <w:bCs/>
+        </w:rPr>
         <w:t xml:space="preserve">Ecological-grain surface is a prediction, not an independent estimate.</w:t>
       </w:r>
       <w:r>
@@ -5897,8 +6131,8 @@
         <w:t xml:space="preserve">above (sobering and clarifying respectively).</w:t>
       </w:r>
     </w:p>
-    <w:bookmarkEnd w:id="27"/>
-    <w:bookmarkStart w:id="28" w:name="conclusion"/>
+    <w:bookmarkEnd w:id="28"/>
+    <w:bookmarkStart w:id="29" w:name="conclusion"/>
     <w:p>
       <w:pPr>
         <w:pStyle w:val="Heading3"/>
@@ -5975,9 +6209,9 @@
         <w:t xml:space="preserve">change.</w:t>
       </w:r>
     </w:p>
-    <w:bookmarkEnd w:id="28"/>
     <w:bookmarkEnd w:id="29"/>
-    <w:bookmarkStart w:id="38" w:name="methods"/>
+    <w:bookmarkEnd w:id="30"/>
+    <w:bookmarkStart w:id="39" w:name="methods"/>
     <w:p>
       <w:pPr>
         <w:pStyle w:val="Heading2"/>
@@ -5986,7 +6220,7 @@
         <w:t xml:space="preserve">Methods</w:t>
       </w:r>
     </w:p>
-    <w:bookmarkStart w:id="30" w:name="study-domain-and-response-variable"/>
+    <w:bookmarkStart w:id="31" w:name="study-domain-and-response-variable"/>
     <w:p>
       <w:pPr>
         <w:pStyle w:val="Heading3"/>
@@ -6039,8 +6273,8 @@
         <w:t xml:space="preserve">set in subsequent years.</w:t>
       </w:r>
     </w:p>
-    <w:bookmarkEnd w:id="30"/>
-    <w:bookmarkStart w:id="31" w:name="conservative-and-relaxed-risk-sets"/>
+    <w:bookmarkEnd w:id="31"/>
+    <w:bookmarkStart w:id="32" w:name="conservative-and-relaxed-risk-sets"/>
     <w:p>
       <w:pPr>
         <w:pStyle w:val="Heading3"/>
@@ -6235,8 +6469,8 @@
         <w:t xml:space="preserve">.</w:t>
       </w:r>
     </w:p>
-    <w:bookmarkEnd w:id="31"/>
-    <w:bookmarkStart w:id="32" w:name="climate-variables"/>
+    <w:bookmarkEnd w:id="32"/>
+    <w:bookmarkStart w:id="33" w:name="climate-variables"/>
     <w:p>
       <w:pPr>
         <w:pStyle w:val="Heading3"/>
@@ -6382,8 +6616,8 @@
         <w:t xml:space="preserve">panel.</w:t>
       </w:r>
     </w:p>
-    <w:bookmarkEnd w:id="32"/>
-    <w:bookmarkStart w:id="33" w:name="X37f70ea4e6afb48fa8cd6cf4f21e7268a7a2244"/>
+    <w:bookmarkEnd w:id="33"/>
+    <w:bookmarkStart w:id="34" w:name="X37f70ea4e6afb48fa8cd6cf4f21e7268a7a2244"/>
     <w:p>
       <w:pPr>
         <w:pStyle w:val="Heading3"/>
@@ -6454,8 +6688,8 @@
         <w:t xml:space="preserve">The contrast between M4 and M5 is the moderation-versus-scaling test.</w:t>
       </w:r>
     </w:p>
-    <w:bookmarkEnd w:id="33"/>
-    <w:bookmarkStart w:id="34" w:name="hazard-model-family"/>
+    <w:bookmarkEnd w:id="34"/>
+    <w:bookmarkStart w:id="35" w:name="hazard-model-family"/>
     <w:p>
       <w:pPr>
         <w:pStyle w:val="Heading3"/>
@@ -6539,8 +6773,8 @@
         <w:t xml:space="preserve">inferential contrasts are M4 versus M3 and M4 versus M5.</w:t>
       </w:r>
     </w:p>
-    <w:bookmarkEnd w:id="34"/>
-    <w:bookmarkStart w:id="35" w:name="spatial-units-and-risk-set-propagation"/>
+    <w:bookmarkEnd w:id="35"/>
+    <w:bookmarkStart w:id="36" w:name="spatial-units-and-risk-set-propagation"/>
     <w:p>
       <w:pPr>
         <w:pStyle w:val="Heading3"/>
@@ -6662,8 +6896,8 @@
         <w:t xml:space="preserve">without memory failure.</w:t>
       </w:r>
     </w:p>
-    <w:bookmarkEnd w:id="35"/>
-    <w:bookmarkStart w:id="36" w:name="Xc27cf9705a478af3154f75126b54d0e54258c1a"/>
+    <w:bookmarkEnd w:id="36"/>
+    <w:bookmarkStart w:id="37" w:name="Xc27cf9705a478af3154f75126b54d0e54258c1a"/>
     <w:p>
       <w:pPr>
         <w:pStyle w:val="Heading3"/>
@@ -6782,8 +7016,8 @@
         <w:t xml:space="preserve">claimed for them here.</w:t>
       </w:r>
     </w:p>
-    <w:bookmarkEnd w:id="36"/>
-    <w:bookmarkStart w:id="37" w:name="reproducibility-and-ethics"/>
+    <w:bookmarkEnd w:id="37"/>
+    <w:bookmarkStart w:id="38" w:name="reproducibility-and-ethics"/>
     <w:p>
       <w:pPr>
         <w:pStyle w:val="Heading3"/>
@@ -6860,9 +7094,9 @@
         <w:t xml:space="preserve">observational biodiversity records and involved no animal handling.</w:t>
       </w:r>
     </w:p>
-    <w:bookmarkEnd w:id="37"/>
     <w:bookmarkEnd w:id="38"/>
-    <w:bookmarkStart w:id="39" w:name="display-items"/>
+    <w:bookmarkEnd w:id="39"/>
+    <w:bookmarkStart w:id="40" w:name="display-items"/>
     <w:p>
       <w:pPr>
         <w:pStyle w:val="Heading2"/>
@@ -7354,6 +7588,120 @@
               <w:pStyle w:val="Compact"/>
             </w:pPr>
             <w:r>
+              <w:t xml:space="preserve">Figure 9</w:t>
+            </w:r>
+          </w:p>
+        </w:tc>
+        <w:tc>
+          <w:tcPr/>
+          <w:p>
+            <w:pPr>
+              <w:pStyle w:val="Compact"/>
+            </w:pPr>
+            <w:r>
+              <w:rPr>
+                <w:rStyle w:val="VerbatimChar"/>
+              </w:rPr>
+              <w:t xml:space="preserve">figures/main/Figure_9_migratory_and_prediction.{pdf,png}</w:t>
+            </w:r>
+          </w:p>
+        </w:tc>
+        <w:tc>
+          <w:tcPr/>
+          <w:p>
+            <w:pPr>
+              <w:pStyle w:val="Compact"/>
+            </w:pPr>
+            <w:r>
+              <w:t xml:space="preserve">(a) interaction by migratory strategy; (b) predictive AUC — interpolation / temporal forecast / spatial extrapolation</w:t>
+            </w:r>
+          </w:p>
+        </w:tc>
+      </w:tr>
+      <w:tr>
+        <w:tc>
+          <w:tcPr/>
+          <w:p>
+            <w:pPr>
+              <w:pStyle w:val="Compact"/>
+            </w:pPr>
+            <w:r>
+              <w:t xml:space="preserve">Table 6</w:t>
+            </w:r>
+          </w:p>
+        </w:tc>
+        <w:tc>
+          <w:tcPr/>
+          <w:p>
+            <w:pPr>
+              <w:pStyle w:val="Compact"/>
+            </w:pPr>
+            <w:r>
+              <w:rPr>
+                <w:rStyle w:val="VerbatimChar"/>
+              </w:rPr>
+              <w:t xml:space="preserve">results/tables/table_migratory_stratified_interaction.csv</w:t>
+            </w:r>
+          </w:p>
+        </w:tc>
+        <w:tc>
+          <w:tcPr/>
+          <w:p>
+            <w:pPr>
+              <w:pStyle w:val="Compact"/>
+            </w:pPr>
+            <w:r>
+              <w:t xml:space="preserve">Interaction HR by migratory group</w:t>
+            </w:r>
+          </w:p>
+        </w:tc>
+      </w:tr>
+      <w:tr>
+        <w:tc>
+          <w:tcPr/>
+          <w:p>
+            <w:pPr>
+              <w:pStyle w:val="Compact"/>
+            </w:pPr>
+            <w:r>
+              <w:t xml:space="preserve">Table 7</w:t>
+            </w:r>
+          </w:p>
+        </w:tc>
+        <w:tc>
+          <w:tcPr/>
+          <w:p>
+            <w:pPr>
+              <w:pStyle w:val="Compact"/>
+            </w:pPr>
+            <w:r>
+              <w:rPr>
+                <w:rStyle w:val="VerbatimChar"/>
+              </w:rPr>
+              <w:t xml:space="preserve">results/tables/table_prediction_accuracy_comparison.csv</w:t>
+            </w:r>
+          </w:p>
+        </w:tc>
+        <w:tc>
+          <w:tcPr/>
+          <w:p>
+            <w:pPr>
+              <w:pStyle w:val="Compact"/>
+            </w:pPr>
+            <w:r>
+              <w:t xml:space="preserve">Predictive AUC across CV regimes + rich-feature importance</w:t>
+            </w:r>
+          </w:p>
+        </w:tc>
+      </w:tr>
+      <w:tr>
+        <w:tc>
+          <w:tcPr/>
+          <w:p>
+            <w:pPr>
+              <w:pStyle w:val="Compact"/>
+            </w:pPr>
+            <w:r>
               <w:t xml:space="preserve">Table S3</w:t>
             </w:r>
           </w:p>
@@ -7687,8 +8035,8 @@
         </w:tc>
       </w:tr>
     </w:tbl>
-    <w:bookmarkEnd w:id="39"/>
-    <w:bookmarkStart w:id="40" w:name="data-availability"/>
+    <w:bookmarkEnd w:id="40"/>
+    <w:bookmarkStart w:id="41" w:name="data-availability"/>
     <w:p>
       <w:pPr>
         <w:pStyle w:val="Heading2"/>
@@ -7747,8 +8095,8 @@
         <w:t xml:space="preserve">the People's Republic of China.</w:t>
       </w:r>
     </w:p>
-    <w:bookmarkEnd w:id="40"/>
-    <w:bookmarkStart w:id="41" w:name="code-availability"/>
+    <w:bookmarkEnd w:id="41"/>
+    <w:bookmarkStart w:id="42" w:name="code-availability"/>
     <w:p>
       <w:pPr>
         <w:pStyle w:val="Heading2"/>
@@ -7801,8 +8149,8 @@
         <w:t xml:space="preserve">be released at Zenodo and mirrored on GitHub on acceptance.</w:t>
       </w:r>
     </w:p>
-    <w:bookmarkEnd w:id="41"/>
-    <w:bookmarkStart w:id="42" w:name="author-contributions"/>
+    <w:bookmarkEnd w:id="42"/>
+    <w:bookmarkStart w:id="43" w:name="author-contributions"/>
     <w:p>
       <w:pPr>
         <w:pStyle w:val="Heading2"/>
@@ -7825,8 +8173,8 @@
         <w:t xml:space="preserve">performed the modelling and diagnostics, and wrote the manuscript.</w:t>
       </w:r>
     </w:p>
-    <w:bookmarkEnd w:id="42"/>
-    <w:bookmarkStart w:id="43" w:name="competing-interests"/>
+    <w:bookmarkEnd w:id="43"/>
+    <w:bookmarkStart w:id="44" w:name="competing-interests"/>
     <w:p>
       <w:pPr>
         <w:pStyle w:val="Heading2"/>
@@ -7843,8 +8191,8 @@
         <w:t xml:space="preserve">The author declares no competing interests.</w:t>
       </w:r>
     </w:p>
-    <w:bookmarkEnd w:id="43"/>
-    <w:bookmarkStart w:id="44" w:name="funding"/>
+    <w:bookmarkEnd w:id="44"/>
+    <w:bookmarkStart w:id="45" w:name="funding"/>
     <w:p>
       <w:pPr>
         <w:pStyle w:val="Heading2"/>
@@ -7861,8 +8209,8 @@
         <w:t xml:space="preserve">[To be completed.]</w:t>
       </w:r>
     </w:p>
-    <w:bookmarkEnd w:id="44"/>
-    <w:bookmarkStart w:id="45" w:name="ai-usage-disclosure"/>
+    <w:bookmarkEnd w:id="45"/>
+    <w:bookmarkStart w:id="46" w:name="ai-usage-disclosure"/>
     <w:p>
       <w:pPr>
         <w:pStyle w:val="Heading2"/>
@@ -7903,8 +8251,8 @@
         <w:t xml:space="preserve">responsibility for the content.</w:t>
       </w:r>
     </w:p>
-    <w:bookmarkEnd w:id="45"/>
-    <w:bookmarkStart w:id="58" w:name="references"/>
+    <w:bookmarkEnd w:id="46"/>
+    <w:bookmarkStart w:id="59" w:name="references"/>
     <w:p>
       <w:pPr>
         <w:pStyle w:val="Heading2"/>
@@ -7945,7 +8293,7 @@
       <w:r>
         <w:t xml:space="preserve"> </w:t>
       </w:r>
-      <w:hyperlink r:id="rId46">
+      <w:hyperlink r:id="rId47">
         <w:r>
           <w:rPr>
             <w:rStyle w:val="Hyperlink"/>
@@ -7986,7 +8334,7 @@
       <w:r>
         <w:t xml:space="preserve"> </w:t>
       </w:r>
-      <w:hyperlink r:id="rId47">
+      <w:hyperlink r:id="rId48">
         <w:r>
           <w:rPr>
             <w:rStyle w:val="Hyperlink"/>
@@ -8027,7 +8375,7 @@
       <w:r>
         <w:t xml:space="preserve"> </w:t>
       </w:r>
-      <w:hyperlink r:id="rId48">
+      <w:hyperlink r:id="rId49">
         <w:r>
           <w:rPr>
             <w:rStyle w:val="Hyperlink"/>
@@ -8082,7 +8430,7 @@
       <w:r>
         <w:t xml:space="preserve"> </w:t>
       </w:r>
-      <w:hyperlink r:id="rId49">
+      <w:hyperlink r:id="rId50">
         <w:r>
           <w:rPr>
             <w:rStyle w:val="Hyperlink"/>
@@ -8129,7 +8477,7 @@
       <w:r>
         <w:t xml:space="preserve"> </w:t>
       </w:r>
-      <w:hyperlink r:id="rId50">
+      <w:hyperlink r:id="rId51">
         <w:r>
           <w:rPr>
             <w:rStyle w:val="Hyperlink"/>
@@ -8176,7 +8524,7 @@
       <w:r>
         <w:t xml:space="preserve"> </w:t>
       </w:r>
-      <w:hyperlink r:id="rId51">
+      <w:hyperlink r:id="rId52">
         <w:r>
           <w:rPr>
             <w:rStyle w:val="Hyperlink"/>
@@ -8223,7 +8571,7 @@
       <w:r>
         <w:t xml:space="preserve"> </w:t>
       </w:r>
-      <w:hyperlink r:id="rId52">
+      <w:hyperlink r:id="rId53">
         <w:r>
           <w:rPr>
             <w:rStyle w:val="Hyperlink"/>
@@ -8264,7 +8612,7 @@
       <w:r>
         <w:t xml:space="preserve"> </w:t>
       </w:r>
-      <w:hyperlink r:id="rId53">
+      <w:hyperlink r:id="rId54">
         <w:r>
           <w:rPr>
             <w:rStyle w:val="Hyperlink"/>
@@ -8305,7 +8653,7 @@
       <w:r>
         <w:t xml:space="preserve"> </w:t>
       </w:r>
-      <w:hyperlink r:id="rId54">
+      <w:hyperlink r:id="rId55">
         <w:r>
           <w:rPr>
             <w:rStyle w:val="Hyperlink"/>
@@ -8346,7 +8694,7 @@
       <w:r>
         <w:t xml:space="preserve"> </w:t>
       </w:r>
-      <w:hyperlink r:id="rId55">
+      <w:hyperlink r:id="rId56">
         <w:r>
           <w:rPr>
             <w:rStyle w:val="Hyperlink"/>
@@ -8420,7 +8768,7 @@
       <w:r>
         <w:t xml:space="preserve"> </w:t>
       </w:r>
-      <w:hyperlink r:id="rId56">
+      <w:hyperlink r:id="rId57">
         <w:r>
           <w:rPr>
             <w:rStyle w:val="Hyperlink"/>
@@ -8481,7 +8829,7 @@
       <w:r>
         <w:t xml:space="preserve"> </w:t>
       </w:r>
-      <w:hyperlink r:id="rId57">
+      <w:hyperlink r:id="rId58">
         <w:r>
           <w:rPr>
             <w:rStyle w:val="Hyperlink"/>
@@ -8535,8 +8883,8 @@
         <w:t xml:space="preserve">citizen-science effort-growth source) the editor requests.</w:t>
       </w:r>
     </w:p>
-    <w:bookmarkEnd w:id="58"/>
     <w:bookmarkEnd w:id="59"/>
+    <w:bookmarkEnd w:id="60"/>
     <w:sectPr>
       <w:footnotePr>
         <w:numRestart w:val="eachSect"/>

</xml_diff>

<commit_message>
Add complete parallel analysis on the relaxed (v3) risk set
Independent full re-analysis of the 188,870-row / 463-species / 817-event set:
- Endogeneity: lagged-effort interaction HR=1.292 (p=9.7e-11, dAIC=36.8)
- Migratory stratification: all groups significant; long-distance migrants
  strongest (HR=1.33) vs residents 1.28 — relaxed set adds effort-driven migrants
- Prediction (rich XGBoost): interpolation 0.76 > spatial 0.62 ~ temporal 0.59
- New: code/68, Figure 10, 4 result tables; manuscript + Chinese summary updated

Co-Authored-By: Claude Opus 4.8 <noreply@anthropic.com>
</commit_message>
<xml_diff>
--- a/manuscript/manuscript_v4_integrated_NEE_EcolLett.docx
+++ b/manuscript/manuscript_v4_integrated_NEE_EcolLett.docx
@@ -4225,6 +4225,204 @@
         <w:pStyle w:val="BodyText"/>
       </w:pPr>
       <w:r>
+        <w:t xml:space="preserve">We re-ran the</w:t>
+      </w:r>
+      <w:r>
+        <w:t xml:space="preserve"> </w:t>
+      </w:r>
+      <w:r>
+        <w:rPr>
+          <w:b/>
+          <w:bCs/>
+        </w:rPr>
+        <w:t xml:space="preserve">full analysis suite on the relaxed set as an independent parallel</w:t>
+      </w:r>
+      <w:r>
+        <w:rPr>
+          <w:b/>
+          <w:bCs/>
+        </w:rPr>
+        <w:t xml:space="preserve"> </w:t>
+      </w:r>
+      <w:r>
+        <w:rPr>
+          <w:b/>
+          <w:bCs/>
+        </w:rPr>
+        <w:t xml:space="preserve">analysis</w:t>
+      </w:r>
+      <w:r>
+        <w:t xml:space="preserve"> </w:t>
+      </w:r>
+      <w:r>
+        <w:t xml:space="preserve">(Fig. 10). The interaction again survived a one-year effort lag</w:t>
+      </w:r>
+      <w:r>
+        <w:t xml:space="preserve"> </w:t>
+      </w:r>
+      <w:r>
+        <w:t xml:space="preserve">(HR = 1.292, 95% CI 1.196–1.396, p = 9.7 × 10⁻¹¹, ΔAIC[M3→M4] = 36.8), confirming</w:t>
+      </w:r>
+      <w:r>
+        <w:t xml:space="preserve"> </w:t>
+      </w:r>
+      <w:r>
+        <w:t xml:space="preserve">the endogeneity defense at scale. Stratifying by migratory strategy, the</w:t>
+      </w:r>
+      <w:r>
+        <w:t xml:space="preserve"> </w:t>
+      </w:r>
+      <w:r>
+        <w:t xml:space="preserve">interaction was significant in every group but — in contrast to the conservative</w:t>
+      </w:r>
+      <w:r>
+        <w:t xml:space="preserve"> </w:t>
+      </w:r>
+      <w:r>
+        <w:t xml:space="preserve">set, where residents were strongest — the relaxed set gave the strongest</w:t>
+      </w:r>
+      <w:r>
+        <w:t xml:space="preserve"> </w:t>
+      </w:r>
+      <w:r>
+        <w:t xml:space="preserve">interaction in</w:t>
+      </w:r>
+      <w:r>
+        <w:t xml:space="preserve"> </w:t>
+      </w:r>
+      <w:r>
+        <w:rPr>
+          <w:b/>
+          <w:bCs/>
+        </w:rPr>
+        <w:t xml:space="preserve">long-distance migrants</w:t>
+      </w:r>
+      <w:r>
+        <w:t xml:space="preserve"> </w:t>
+      </w:r>
+      <w:r>
+        <w:t xml:space="preserve">(HR = 1.33, p = 7 × 10⁻⁶), with migrants</w:t>
+      </w:r>
+      <w:r>
+        <w:t xml:space="preserve"> </w:t>
+      </w:r>
+      <w:r>
+        <w:t xml:space="preserve">overall (1.29) ≥ residents (1.28); the species added by relaxation are</w:t>
+      </w:r>
+      <w:r>
+        <w:t xml:space="preserve"> </w:t>
+      </w:r>
+      <w:r>
+        <w:t xml:space="preserve">disproportionately migrant/vagrant taxa whose records track effort-rich</w:t>
+      </w:r>
+      <w:r>
+        <w:t xml:space="preserve"> </w:t>
+      </w:r>
+      <w:r>
+        <w:t xml:space="preserve">landscapes, exactly the effort-density regime the boundary describes. Predictive</w:t>
+      </w:r>
+      <w:r>
+        <w:t xml:space="preserve"> </w:t>
+      </w:r>
+      <w:r>
+        <w:t xml:space="preserve">validation showed the same scope-dependence as the conservative set</w:t>
+      </w:r>
+      <w:r>
+        <w:t xml:space="preserve"> </w:t>
+      </w:r>
+      <w:r>
+        <w:t xml:space="preserve">(interpolation AUC 0.76 &gt; spatial-block 0.62 ≈ temporal 0.59), the larger event</w:t>
+      </w:r>
+      <w:r>
+        <w:t xml:space="preserve"> </w:t>
+      </w:r>
+      <w:r>
+        <w:t xml:space="preserve">base lifting in-domain discrimination.</w:t>
+      </w:r>
+    </w:p>
+    <w:p>
+      <w:pPr>
+        <w:pStyle w:val="BodyText"/>
+      </w:pPr>
+      <w:r>
+        <w:rPr>
+          <w:i/>
+          <w:iCs/>
+        </w:rPr>
+        <w:t xml:space="preserve">Source:</w:t>
+      </w:r>
+      <w:r>
+        <w:rPr>
+          <w:i/>
+          <w:iCs/>
+        </w:rPr>
+        <w:t xml:space="preserve"> </w:t>
+      </w:r>
+      <w:r>
+        <w:rPr>
+          <w:rStyle w:val="VerbatimChar"/>
+          <w:i/>
+          <w:iCs/>
+        </w:rPr>
+        <w:t xml:space="preserve">results/tables/table_v3_endogeneity_lag.csv</w:t>
+      </w:r>
+      <w:r>
+        <w:rPr>
+          <w:i/>
+          <w:iCs/>
+        </w:rPr>
+        <w:t xml:space="preserve">,</w:t>
+      </w:r>
+      <w:r>
+        <w:rPr>
+          <w:i/>
+          <w:iCs/>
+        </w:rPr>
+        <w:t xml:space="preserve"> </w:t>
+      </w:r>
+      <w:r>
+        <w:rPr>
+          <w:rStyle w:val="VerbatimChar"/>
+          <w:i/>
+          <w:iCs/>
+        </w:rPr>
+        <w:t xml:space="preserve">table_v3_migratory_stratified.csv</w:t>
+      </w:r>
+      <w:r>
+        <w:rPr>
+          <w:i/>
+          <w:iCs/>
+        </w:rPr>
+        <w:t xml:space="preserve">,</w:t>
+      </w:r>
+      <w:r>
+        <w:rPr>
+          <w:i/>
+          <w:iCs/>
+        </w:rPr>
+        <w:t xml:space="preserve"> </w:t>
+      </w:r>
+      <w:r>
+        <w:rPr>
+          <w:rStyle w:val="VerbatimChar"/>
+          <w:i/>
+          <w:iCs/>
+        </w:rPr>
+        <w:t xml:space="preserve">table_v3_prediction_accuracy.csv</w:t>
+      </w:r>
+      <w:r>
+        <w:rPr>
+          <w:i/>
+          <w:iCs/>
+        </w:rPr>
+        <w:t xml:space="preserve">.</w:t>
+      </w:r>
+    </w:p>
+    <w:p>
+      <w:pPr>
+        <w:pStyle w:val="BodyText"/>
+      </w:pPr>
+      <w:r>
         <w:rPr>
           <w:b/>
           <w:bCs/>
@@ -7690,6 +7888,82 @@
             </w:pPr>
             <w:r>
               <w:t xml:space="preserve">Predictive AUC across CV regimes + rich-feature importance</w:t>
+            </w:r>
+          </w:p>
+        </w:tc>
+      </w:tr>
+      <w:tr>
+        <w:tc>
+          <w:tcPr/>
+          <w:p>
+            <w:pPr>
+              <w:pStyle w:val="Compact"/>
+            </w:pPr>
+            <w:r>
+              <w:t xml:space="preserve">Figure 10</w:t>
+            </w:r>
+          </w:p>
+        </w:tc>
+        <w:tc>
+          <w:tcPr/>
+          <w:p>
+            <w:pPr>
+              <w:pStyle w:val="Compact"/>
+            </w:pPr>
+            <w:r>
+              <w:rPr>
+                <w:rStyle w:val="VerbatimChar"/>
+              </w:rPr>
+              <w:t xml:space="preserve">figures/main/Figure_10_v3_full_analysis.{pdf,png}</w:t>
+            </w:r>
+          </w:p>
+        </w:tc>
+        <w:tc>
+          <w:tcPr/>
+          <w:p>
+            <w:pPr>
+              <w:pStyle w:val="Compact"/>
+            </w:pPr>
+            <w:r>
+              <w:t xml:space="preserve">Full parallel analysis on the relaxed (v3) set: migratory interaction + predictive AUC</w:t>
+            </w:r>
+          </w:p>
+        </w:tc>
+      </w:tr>
+      <w:tr>
+        <w:tc>
+          <w:tcPr/>
+          <w:p>
+            <w:pPr>
+              <w:pStyle w:val="Compact"/>
+            </w:pPr>
+            <w:r>
+              <w:t xml:space="preserve">Table 8</w:t>
+            </w:r>
+          </w:p>
+        </w:tc>
+        <w:tc>
+          <w:tcPr/>
+          <w:p>
+            <w:pPr>
+              <w:pStyle w:val="Compact"/>
+            </w:pPr>
+            <w:r>
+              <w:rPr>
+                <w:rStyle w:val="VerbatimChar"/>
+              </w:rPr>
+              <w:t xml:space="preserve">results/tables/table_v3_{endogeneity_lag,migratory_stratified,prediction_accuracy}.csv</w:t>
+            </w:r>
+          </w:p>
+        </w:tc>
+        <w:tc>
+          <w:tcPr/>
+          <w:p>
+            <w:pPr>
+              <w:pStyle w:val="Compact"/>
+            </w:pPr>
+            <w:r>
+              <w:t xml:space="preserve">Relaxed-set parallel analysis (endogeneity, migratory, prediction)</w:t>
             </w:r>
           </w:p>
         </w:tc>

</xml_diff>

<commit_message>
Add v3 grid plug-in maps + finalization review and citation audit
- v3 relaxed-set grid plug-in hazard maps (100/50 km), parallel to Fig 8/8b,
  same CMIP6 + SSP-effort + nine-dash-line basemap (province interaction HR=1.274)
- Finalization: citation audit (13 refs, DOIs present, 2 web-verified, no orphans),
  internal-consistency scan passed, provenance note updated to current state
- New: code/69, Figure_8_v3 + 8b_v3, pipeline_finalization_and_citation_audit.md

Co-Authored-By: Claude Opus 4.8 <noreply@anthropic.com>
</commit_message>
<xml_diff>
--- a/manuscript/manuscript_v4_integrated_NEE_EcolLett.docx
+++ b/manuscript/manuscript_v4_integrated_NEE_EcolLett.docx
@@ -177,65 +177,43 @@
         <w:t xml:space="preserve">results/</w:t>
       </w:r>
       <w:r>
-        <w:t xml:space="preserve"> </w:t>
-      </w:r>
-      <w:r>
-        <w:t xml:space="preserve">of the</w:t>
-      </w:r>
-      <w:r>
-        <w:t xml:space="preserve"> </w:t>
-      </w:r>
-      <w:r>
-        <w:rPr>
-          <w:rStyle w:val="VerbatimChar"/>
-        </w:rPr>
-        <w:t xml:space="preserve">bird_hazard_model_effort_upgrade_v2</w:t>
-      </w:r>
-      <w:r>
-        <w:t xml:space="preserve"> </w:t>
-      </w:r>
-      <w:r>
-        <w:t xml:space="preserve">project. Analyses that</w:t>
-      </w:r>
-      <w:r>
-        <w:t xml:space="preserve"> </w:t>
-      </w:r>
-      <w:r>
-        <w:t xml:space="preserve">were scripted but not yet written to a result table (grid-native 50/100 km</w:t>
-      </w:r>
-      <w:r>
-        <w:t xml:space="preserve"> </w:t>
-      </w:r>
-      <w:r>
-        <w:t xml:space="preserve">refits, spatial-block cross-validation, forecast-skill PSI) are described as</w:t>
-      </w:r>
-      <w:r>
-        <w:t xml:space="preserve"> </w:t>
-      </w:r>
-      <w:r>
-        <w:t xml:space="preserve">method-ready future work and carry</w:t>
-      </w:r>
-      <w:r>
-        <w:t xml:space="preserve"> </w:t>
-      </w:r>
-      <w:r>
-        <w:rPr>
-          <w:b/>
-          <w:bCs/>
-        </w:rPr>
-        <w:t xml:space="preserve">no numerical claim</w:t>
-      </w:r>
-      <w:r>
-        <w:t xml:space="preserve"> </w:t>
-      </w:r>
-      <w:r>
-        <w:t xml:space="preserve">in the text. See the</w:t>
-      </w:r>
-      <w:r>
-        <w:t xml:space="preserve"> </w:t>
-      </w:r>
-      <w:r>
-        <w:t xml:space="preserve">companion file</w:t>
+        <w:t xml:space="preserve">.</w:t>
+      </w:r>
+      <w:r>
+        <w:t xml:space="preserve"> </w:t>
+      </w:r>
+      <w:r>
+        <w:t xml:space="preserve">The grid-native 50/100 km surfaces (CRU climate × merged effort), spatial-block</w:t>
+      </w:r>
+      <w:r>
+        <w:t xml:space="preserve"> </w:t>
+      </w:r>
+      <w:r>
+        <w:t xml:space="preserve">cross-validation, the lagged-effort endogeneity test, migratory stratification,</w:t>
+      </w:r>
+      <w:r>
+        <w:t xml:space="preserve"> </w:t>
+      </w:r>
+      <w:r>
+        <w:t xml:space="preserve">the relaxed-set parallel analysis and the CMIP6 ensemble futures are all now</w:t>
+      </w:r>
+      <w:r>
+        <w:t xml:space="preserve"> </w:t>
+      </w:r>
+      <w:r>
+        <w:t xml:space="preserve">computed and reported with numbers. The only items still described as</w:t>
+      </w:r>
+      <w:r>
+        <w:t xml:space="preserve"> </w:t>
+      </w:r>
+      <w:r>
+        <w:t xml:space="preserve">method-ready (no numerical claim) are the six-climate-metric interaction matrix</w:t>
+      </w:r>
+      <w:r>
+        <w:t xml:space="preserve"> </w:t>
+      </w:r>
+      <w:r>
+        <w:t xml:space="preserve">and per-feature forecast-skill PSI. See</w:t>
       </w:r>
       <w:r>
         <w:t xml:space="preserve"> </w:t>
@@ -251,7 +229,13 @@
         <w:t xml:space="preserve"> </w:t>
       </w:r>
       <w:r>
-        <w:t xml:space="preserve">for the full table-to-claim map.</w:t>
+        <w:t xml:space="preserve">for the</w:t>
+      </w:r>
+      <w:r>
+        <w:t xml:space="preserve"> </w:t>
+      </w:r>
+      <w:r>
+        <w:t xml:space="preserve">full table-to-claim map.</w:t>
       </w:r>
     </w:p>
     <w:p>
@@ -7926,6 +7910,59 @@
             </w:pPr>
             <w:r>
               <w:t xml:space="preserve">Full parallel analysis on the relaxed (v3) set: migratory interaction + predictive AUC</w:t>
+            </w:r>
+          </w:p>
+        </w:tc>
+      </w:tr>
+      <w:tr>
+        <w:tc>
+          <w:tcPr/>
+          <w:p>
+            <w:pPr>
+              <w:pStyle w:val="Compact"/>
+            </w:pPr>
+            <w:r>
+              <w:t xml:space="preserve">Figure 8 (v3)</w:t>
+            </w:r>
+          </w:p>
+        </w:tc>
+        <w:tc>
+          <w:tcPr/>
+          <w:p>
+            <w:pPr>
+              <w:pStyle w:val="Compact"/>
+            </w:pPr>
+            <w:r>
+              <w:rPr>
+                <w:rStyle w:val="VerbatimChar"/>
+              </w:rPr>
+              <w:t xml:space="preserve">figures/main/Figure_8_v3_grid100_plugin_hazard.{pdf,png}</w:t>
+            </w:r>
+            <w:r>
+              <w:t xml:space="preserve"> </w:t>
+            </w:r>
+            <w:r>
+              <w:t xml:space="preserve">/</w:t>
+            </w:r>
+            <w:r>
+              <w:t xml:space="preserve"> </w:t>
+            </w:r>
+            <w:r>
+              <w:rPr>
+                <w:rStyle w:val="VerbatimChar"/>
+              </w:rPr>
+              <w:t xml:space="preserve">Figure_8b_v3_grid50_plugin_hazard.{pdf,png}</w:t>
+            </w:r>
+          </w:p>
+        </w:tc>
+        <w:tc>
+          <w:tcPr/>
+          <w:p>
+            <w:pPr>
+              <w:pStyle w:val="Compact"/>
+            </w:pPr>
+            <w:r>
+              <w:t xml:space="preserve">Relaxed-set grid plug-in hazard (100/50 km), parallel to Fig 8/8b</w:t>
             </w:r>
           </w:p>
         </w:tc>

</xml_diff>